<commit_message>
Add raking weights and construct indices
Implement raking to age/sex/urban margins and save sample weights (weight, weight_ipw, weight_final); create a weighted survey design and add diagnostic summaries (svymean, svytable, svyquantile). Recode and rescale multiple variables and build composite indices: consultation_exclusion, ria_manipulation, transparency, procurement_concentration, admin_particularism (including factor-analysis-based weights), and impunity_track. Add various diagnostics (correlations, factor analysis, plots) and clean up/replace older commented or duplicated code. Update CMS_CAR_DOCUMENTATION.Rmd text to English for the final weighted database section. Also update the Quick_manuscript.docx binary (manuscript file changed).
</commit_message>
<xml_diff>
--- a/analysis/deep_data/Quick_manuscript.docx
+++ b/analysis/deep_data/Quick_manuscript.docx
@@ -151,13 +151,7 @@
               <w:rPr>
                 <w:rFonts w:ascii="Cambria Math" w:hAnsi="Cambria Math"/>
               </w:rPr>
-              <m:t>H</m:t>
-            </m:r>
-            <m:r>
-              <w:rPr>
-                <w:rFonts w:ascii="Cambria Math" w:hAnsi="Cambria Math"/>
-              </w:rPr>
-              <m:t>E</m:t>
+              <m:t>HE</m:t>
             </m:r>
           </m:sub>
         </m:sSub>
@@ -185,10 +179,7 @@
         <w:t xml:space="preserve">are </w:t>
       </w:r>
       <w:r>
-        <w:t xml:space="preserve">Corruption </w:t>
-      </w:r>
-      <w:r>
-        <w:t>among</w:t>
+        <w:t>Corruption among</w:t>
       </w:r>
       <w:r>
         <w:t xml:space="preserve"> </w:t>
@@ -315,20 +306,7 @@
           <w:rPr>
             <w:rFonts w:ascii="Cambria Math" w:hAnsi="Cambria Math"/>
           </w:rPr>
-          <w:lastRenderedPageBreak/>
-          <m:t>Experienc</m:t>
-        </m:r>
-        <m:r>
-          <w:rPr>
-            <w:rFonts w:ascii="Cambria Math" w:hAnsi="Cambria Math"/>
-          </w:rPr>
-          <m:t>e</m:t>
-        </m:r>
-        <m:r>
-          <w:rPr>
-            <w:rFonts w:ascii="Cambria Math" w:hAnsi="Cambria Math"/>
-          </w:rPr>
-          <m:t xml:space="preserve"> = mean(A12A, A12B, A13A, A13B, A13C)</m:t>
+          <m:t>Experience = mean(A12A, A12B, A13A, A13B, A13C)</m:t>
         </m:r>
       </m:oMath>
       <w:r>
@@ -398,31 +376,7 @@
           <w:rPr>
             <w:rFonts w:ascii="Cambria Math" w:hAnsi="Cambria Math"/>
           </w:rPr>
-          <m:t>Distrus</m:t>
-        </m:r>
-        <m:r>
-          <w:rPr>
-            <w:rFonts w:ascii="Cambria Math" w:hAnsi="Cambria Math"/>
-          </w:rPr>
-          <m:t>t</m:t>
-        </m:r>
-        <m:r>
-          <w:rPr>
-            <w:rFonts w:ascii="Cambria Math" w:hAnsi="Cambria Math"/>
-          </w:rPr>
-          <m:t xml:space="preserve"> = 5 - mea</m:t>
-        </m:r>
-        <m:r>
-          <w:rPr>
-            <w:rFonts w:ascii="Cambria Math" w:hAnsi="Cambria Math"/>
-          </w:rPr>
-          <m:t>n</m:t>
-        </m:r>
-        <m:r>
-          <w:rPr>
-            <w:rFonts w:ascii="Cambria Math" w:hAnsi="Cambria Math"/>
-          </w:rPr>
-          <m:t>(D51B, D51C)</m:t>
+          <m:t>Distrust = 5 - mean(D51B, D51C)</m:t>
         </m:r>
       </m:oMath>
       <w:r>
@@ -479,7 +433,7 @@
           <w:rPr>
             <w:rFonts w:ascii="Cambria Math" w:hAnsi="Cambria Math"/>
           </w:rPr>
-          <m:t>State Capture = mean(L_PROC_A, L_PROC_B, L_PROC_C, L_LOB, SC4, SC5)</m:t>
+          <m:t>State Capture = mean(L_PROC_A, L_PROC_B, L_PROC_C, L_LOB, SC4)</m:t>
         </m:r>
       </m:oMath>
       <w:r>
@@ -591,12 +545,6 @@
         <w:gridCol w:w="1438"/>
       </w:tblGrid>
       <w:tr>
-        <w:tblPrEx>
-          <w:tblCellMar>
-            <w:top w:w="0" w:type="dxa"/>
-            <w:bottom w:w="0" w:type="dxa"/>
-          </w:tblCellMar>
-        </w:tblPrEx>
         <w:trPr>
           <w:cantSplit/>
           <w:jc w:val="center"/>
@@ -637,12 +585,6 @@
         </w:tc>
       </w:tr>
       <w:tr>
-        <w:tblPrEx>
-          <w:tblCellMar>
-            <w:top w:w="0" w:type="dxa"/>
-            <w:bottom w:w="0" w:type="dxa"/>
-          </w:tblCellMar>
-        </w:tblPrEx>
         <w:trPr>
           <w:cantSplit/>
           <w:jc w:val="center"/>
@@ -838,12 +780,6 @@
         </w:tc>
       </w:tr>
       <w:tr>
-        <w:tblPrEx>
-          <w:tblCellMar>
-            <w:top w:w="0" w:type="dxa"/>
-            <w:bottom w:w="0" w:type="dxa"/>
-          </w:tblCellMar>
-        </w:tblPrEx>
         <w:trPr>
           <w:cantSplit/>
           <w:jc w:val="center"/>
@@ -869,7 +805,6 @@
                 <w:iCs/>
               </w:rPr>
             </w:pPr>
-            <w:proofErr w:type="spellStart"/>
             <w:r>
               <w:rPr>
                 <w:b/>
@@ -879,7 +814,6 @@
               </w:rPr>
               <w:t>corr_highed</w:t>
             </w:r>
-            <w:proofErr w:type="spellEnd"/>
           </w:p>
         </w:tc>
         <w:tc>
@@ -1044,12 +978,6 @@
         </w:tc>
       </w:tr>
       <w:tr>
-        <w:tblPrEx>
-          <w:tblCellMar>
-            <w:top w:w="0" w:type="dxa"/>
-            <w:bottom w:w="0" w:type="dxa"/>
-          </w:tblCellMar>
-        </w:tblPrEx>
         <w:trPr>
           <w:cantSplit/>
           <w:jc w:val="center"/>
@@ -1075,7 +1003,6 @@
                 <w:iCs/>
               </w:rPr>
             </w:pPr>
-            <w:proofErr w:type="spellStart"/>
             <w:r>
               <w:rPr>
                 <w:b/>
@@ -1085,7 +1012,6 @@
               </w:rPr>
               <w:t>corr_general</w:t>
             </w:r>
-            <w:proofErr w:type="spellEnd"/>
           </w:p>
         </w:tc>
         <w:tc>
@@ -1250,12 +1176,6 @@
         </w:tc>
       </w:tr>
       <w:tr>
-        <w:tblPrEx>
-          <w:tblCellMar>
-            <w:top w:w="0" w:type="dxa"/>
-            <w:bottom w:w="0" w:type="dxa"/>
-          </w:tblCellMar>
-        </w:tblPrEx>
         <w:trPr>
           <w:cantSplit/>
           <w:jc w:val="center"/>
@@ -1281,7 +1201,6 @@
                 <w:iCs/>
               </w:rPr>
             </w:pPr>
-            <w:proofErr w:type="spellStart"/>
             <w:r>
               <w:rPr>
                 <w:b/>
@@ -1291,7 +1210,6 @@
               </w:rPr>
               <w:t>tolerance_index</w:t>
             </w:r>
-            <w:proofErr w:type="spellEnd"/>
           </w:p>
         </w:tc>
         <w:tc>
@@ -1456,12 +1374,6 @@
         </w:tc>
       </w:tr>
       <w:tr>
-        <w:tblPrEx>
-          <w:tblCellMar>
-            <w:top w:w="0" w:type="dxa"/>
-            <w:bottom w:w="0" w:type="dxa"/>
-          </w:tblCellMar>
-        </w:tblPrEx>
         <w:trPr>
           <w:cantSplit/>
           <w:jc w:val="center"/>
@@ -1487,7 +1399,6 @@
                 <w:iCs/>
               </w:rPr>
             </w:pPr>
-            <w:proofErr w:type="spellStart"/>
             <w:r>
               <w:rPr>
                 <w:b/>
@@ -1497,7 +1408,6 @@
               </w:rPr>
               <w:t>experience_index</w:t>
             </w:r>
-            <w:proofErr w:type="spellEnd"/>
           </w:p>
         </w:tc>
         <w:tc>
@@ -1662,12 +1572,6 @@
         </w:tc>
       </w:tr>
       <w:tr>
-        <w:tblPrEx>
-          <w:tblCellMar>
-            <w:top w:w="0" w:type="dxa"/>
-            <w:bottom w:w="0" w:type="dxa"/>
-          </w:tblCellMar>
-        </w:tblPrEx>
         <w:trPr>
           <w:cantSplit/>
           <w:jc w:val="center"/>
@@ -1693,7 +1597,6 @@
                 <w:iCs/>
               </w:rPr>
             </w:pPr>
-            <w:proofErr w:type="spellStart"/>
             <w:r>
               <w:rPr>
                 <w:b/>
@@ -1701,9 +1604,9 @@
                 <w:i/>
                 <w:iCs/>
               </w:rPr>
+              <w:lastRenderedPageBreak/>
               <w:t>distrust_highed</w:t>
             </w:r>
-            <w:proofErr w:type="spellEnd"/>
           </w:p>
         </w:tc>
         <w:tc>
@@ -1868,12 +1771,6 @@
         </w:tc>
       </w:tr>
       <w:tr>
-        <w:tblPrEx>
-          <w:tblCellMar>
-            <w:top w:w="0" w:type="dxa"/>
-            <w:bottom w:w="0" w:type="dxa"/>
-          </w:tblCellMar>
-        </w:tblPrEx>
         <w:trPr>
           <w:cantSplit/>
           <w:jc w:val="center"/>
@@ -1899,7 +1796,6 @@
                 <w:iCs/>
               </w:rPr>
             </w:pPr>
-            <w:proofErr w:type="spellStart"/>
             <w:r>
               <w:rPr>
                 <w:b/>
@@ -1909,7 +1805,6 @@
               </w:rPr>
               <w:t>state_capture</w:t>
             </w:r>
-            <w:proofErr w:type="spellEnd"/>
           </w:p>
         </w:tc>
         <w:tc>
@@ -2074,12 +1969,6 @@
         </w:tc>
       </w:tr>
       <w:tr>
-        <w:tblPrEx>
-          <w:tblCellMar>
-            <w:top w:w="0" w:type="dxa"/>
-            <w:bottom w:w="0" w:type="dxa"/>
-          </w:tblCellMar>
-        </w:tblPrEx>
         <w:trPr>
           <w:cantSplit/>
           <w:jc w:val="center"/>
@@ -2380,19 +2269,7 @@
             <w:rPr>
               <w:rFonts w:ascii="Cambria Math" w:hAnsi="Cambria Math"/>
             </w:rPr>
-            <m:t xml:space="preserve"> =</m:t>
-          </m:r>
-          <m:r>
-            <w:rPr>
-              <w:rFonts w:ascii="Cambria Math" w:hAnsi="Cambria Math"/>
-            </w:rPr>
-            <m:t>α</m:t>
-          </m:r>
-          <m:r>
-            <w:rPr>
-              <w:rFonts w:ascii="Cambria Math" w:hAnsi="Cambria Math"/>
-            </w:rPr>
-            <m:t xml:space="preserve"> +</m:t>
+            <m:t xml:space="preserve"> =α +</m:t>
           </m:r>
           <m:sSub>
             <m:sSubPr>
@@ -2424,13 +2301,7 @@
             <w:rPr>
               <w:rFonts w:ascii="Cambria Math" w:hAnsi="Cambria Math"/>
             </w:rPr>
-            <m:t xml:space="preserve"> </m:t>
-          </m:r>
-          <m:r>
-            <w:rPr>
-              <w:rFonts w:ascii="Cambria Math" w:hAnsi="Cambria Math"/>
-            </w:rPr>
-            <m:t xml:space="preserve"> Toleranc</m:t>
+            <m:t xml:space="preserve">  Toleranc</m:t>
           </m:r>
           <m:sSub>
             <m:sSubPr>
@@ -2599,28 +2470,13 @@
             <w:rPr>
               <w:rFonts w:ascii="Cambria Math" w:hAnsi="Cambria Math"/>
             </w:rPr>
-            <m:t>+</m:t>
-          </m:r>
-          <m:r>
-            <m:rPr>
-              <m:sty m:val="p"/>
-            </m:rPr>
-            <w:rPr>
-              <w:rFonts w:ascii="Cambria Math" w:hAnsi="Cambria Math"/>
-            </w:rPr>
-            <m:t xml:space="preserve"> </m:t>
+            <m:t xml:space="preserve">+ </m:t>
           </m:r>
           <m:r>
             <w:rPr>
               <w:rFonts w:ascii="Cambria Math" w:hAnsi="Cambria Math"/>
             </w:rPr>
-            <m:t>γ</m:t>
-          </m:r>
-          <m:r>
-            <w:rPr>
-              <w:rFonts w:ascii="Cambria Math" w:hAnsi="Cambria Math"/>
-            </w:rPr>
-            <m:t xml:space="preserve"> </m:t>
+            <m:t xml:space="preserve">γ </m:t>
           </m:r>
           <m:sSub>
             <m:sSubPr>
@@ -2681,6 +2537,9 @@
             </m:sub>
           </m:sSub>
           <m:r>
+            <m:rPr>
+              <m:sty m:val="p"/>
+            </m:rPr>
             <w:br/>
           </m:r>
         </m:oMath>
@@ -2799,19 +2658,7 @@
             <w:rPr>
               <w:rFonts w:ascii="Cambria Math" w:hAnsi="Cambria Math"/>
             </w:rPr>
-            <m:t xml:space="preserve"> =</m:t>
-          </m:r>
-          <m:r>
-            <w:rPr>
-              <w:rFonts w:ascii="Cambria Math" w:hAnsi="Cambria Math"/>
-            </w:rPr>
-            <m:t>α</m:t>
-          </m:r>
-          <m:r>
-            <w:rPr>
-              <w:rFonts w:ascii="Cambria Math" w:hAnsi="Cambria Math"/>
-            </w:rPr>
-            <m:t xml:space="preserve"> +</m:t>
+            <m:t xml:space="preserve"> =α +</m:t>
           </m:r>
           <m:sSub>
             <m:sSubPr>
@@ -2843,13 +2690,7 @@
             <w:rPr>
               <w:rFonts w:ascii="Cambria Math" w:hAnsi="Cambria Math"/>
             </w:rPr>
-            <m:t xml:space="preserve"> </m:t>
-          </m:r>
-          <m:r>
-            <w:rPr>
-              <w:rFonts w:ascii="Cambria Math" w:hAnsi="Cambria Math"/>
-            </w:rPr>
-            <m:t xml:space="preserve"> Toleranc</m:t>
+            <m:t xml:space="preserve">  Toleranc</m:t>
           </m:r>
           <m:sSub>
             <m:sSubPr>
@@ -3078,28 +2919,13 @@
             <w:rPr>
               <w:rFonts w:ascii="Cambria Math" w:hAnsi="Cambria Math"/>
             </w:rPr>
-            <m:t>+</m:t>
-          </m:r>
-          <m:r>
-            <m:rPr>
-              <m:sty m:val="p"/>
-            </m:rPr>
-            <w:rPr>
-              <w:rFonts w:ascii="Cambria Math" w:hAnsi="Cambria Math"/>
-            </w:rPr>
-            <m:t xml:space="preserve"> </m:t>
+            <m:t xml:space="preserve">+ </m:t>
           </m:r>
           <m:r>
             <w:rPr>
               <w:rFonts w:ascii="Cambria Math" w:hAnsi="Cambria Math"/>
             </w:rPr>
-            <m:t>γ</m:t>
-          </m:r>
-          <m:r>
-            <w:rPr>
-              <w:rFonts w:ascii="Cambria Math" w:hAnsi="Cambria Math"/>
-            </w:rPr>
-            <m:t xml:space="preserve"> </m:t>
+            <m:t xml:space="preserve">γ </m:t>
           </m:r>
           <m:sSub>
             <m:sSubPr>
@@ -3215,14 +3041,11 @@
         <w:t>From table 1, p</w:t>
       </w:r>
       <w:r>
-        <w:t xml:space="preserve">erceptions of corruption in higher education are moderately high, with an average value of 2.73 on a four-point scale, indicating that respondents tend to view teachers and university officials as relatively prone to corrupt behavior. At the same time, general corruption perceptions are lower (mean = 1.95), suggesting that higher education is not perceived as the most corrupt domain, but still exhibits notable integrity concerns. Corruption tolerance is substantially elevated (mean = 3.37), pointing to widespread acceptance of corrupt practices </w:t>
+        <w:t xml:space="preserve">erceptions of corruption in higher education are moderately high, with an average value of 2.73 on a four-point scale, indicating that respondents tend to view teachers and university officials as relatively prone to corrupt behavior. At the same time, general corruption perceptions are lower (mean = 1.95), suggesting that higher education is not perceived as the most corrupt domain, but still exhibits notable integrity concerns. Corruption tolerance is substantially elevated (mean = 3.37), pointing to widespread acceptance of corrupt practices under certain conditions, while reported experience with corruption is moderate (mean = 4.64 on </w:t>
       </w:r>
       <w:r>
         <w:lastRenderedPageBreak/>
-        <w:t xml:space="preserve">under certain conditions, while reported experience with corruption is moderate (mean = 4.64 on a nine-point scale). Institutional distrust is also relatively high (mean = 2.79), reflecting broader skepticism toward public actors, whereas the state capture index displays a lower average level (mean = 1.72), despite its strong explanatory role in subsequent </w:t>
-      </w:r>
-      <w:r>
-        <w:t>analysis.</w:t>
+        <w:t>a nine-point scale). Institutional distrust is also relatively high (mean = 2.79), reflecting broader skepticism toward public actors, whereas the state capture index displays a lower average level (mean = 1.72), despite its strong explanatory role in subsequent analysis.</w:t>
       </w:r>
     </w:p>
     <w:p>
@@ -3343,7 +3166,6 @@
                 <w:lang w:eastAsia="en-US"/>
               </w:rPr>
             </w:pPr>
-            <w:proofErr w:type="spellStart"/>
             <w:r>
               <w:rPr>
                 <w:rFonts w:ascii="Arial" w:eastAsia="Times New Roman" w:hAnsi="Arial" w:cs="Arial"/>
@@ -3354,10 +3176,905 @@
                 <w:szCs w:val="18"/>
                 <w:lang w:eastAsia="en-US"/>
               </w:rPr>
-              <w:t>corr_highed</w:t>
-            </w:r>
-            <w:proofErr w:type="spellEnd"/>
-            <w:r>
+              <w:t>corr_highed &amp; level of education</w:t>
+            </w:r>
+          </w:p>
+        </w:tc>
+      </w:tr>
+      <w:tr>
+        <w:trPr>
+          <w:trHeight w:val="480"/>
+          <w:jc w:val="center"/>
+        </w:trPr>
+        <w:tc>
+          <w:tcPr>
+            <w:tcW w:w="960" w:type="dxa"/>
+            <w:tcBorders>
+              <w:top w:val="nil"/>
+              <w:left w:val="single" w:sz="4" w:space="0" w:color="auto"/>
+              <w:bottom w:val="single" w:sz="4" w:space="0" w:color="auto"/>
+              <w:right w:val="single" w:sz="4" w:space="0" w:color="auto"/>
+            </w:tcBorders>
+            <w:shd w:val="clear" w:color="auto" w:fill="auto"/>
+            <w:vAlign w:val="bottom"/>
+            <w:hideMark/>
+          </w:tcPr>
+          <w:p>
+            <w:pPr>
+              <w:rPr>
+                <w:rFonts w:ascii="Arial" w:eastAsia="Times New Roman" w:hAnsi="Arial" w:cs="Arial"/>
+                <w:color w:val="333399"/>
+                <w:sz w:val="18"/>
+                <w:szCs w:val="18"/>
+                <w:lang w:eastAsia="en-US"/>
+              </w:rPr>
+            </w:pPr>
+            <w:r>
+              <w:rPr>
+                <w:rFonts w:ascii="Arial" w:eastAsia="Times New Roman" w:hAnsi="Arial" w:cs="Arial"/>
+                <w:color w:val="333399"/>
+                <w:sz w:val="18"/>
+                <w:szCs w:val="18"/>
+                <w:lang w:eastAsia="en-US"/>
+              </w:rPr>
+              <w:t> </w:t>
+            </w:r>
+          </w:p>
+        </w:tc>
+        <w:tc>
+          <w:tcPr>
+            <w:tcW w:w="960" w:type="dxa"/>
+            <w:tcBorders>
+              <w:top w:val="nil"/>
+              <w:left w:val="nil"/>
+              <w:bottom w:val="single" w:sz="4" w:space="0" w:color="auto"/>
+              <w:right w:val="single" w:sz="4" w:space="0" w:color="auto"/>
+            </w:tcBorders>
+            <w:shd w:val="clear" w:color="auto" w:fill="auto"/>
+            <w:vAlign w:val="bottom"/>
+            <w:hideMark/>
+          </w:tcPr>
+          <w:p>
+            <w:pPr>
+              <w:jc w:val="center"/>
+              <w:rPr>
+                <w:rFonts w:ascii="Arial" w:eastAsia="Times New Roman" w:hAnsi="Arial" w:cs="Arial"/>
+                <w:color w:val="333399"/>
+                <w:sz w:val="18"/>
+                <w:szCs w:val="18"/>
+                <w:lang w:eastAsia="en-US"/>
+              </w:rPr>
+            </w:pPr>
+            <w:r>
+              <w:rPr>
+                <w:rFonts w:ascii="Arial" w:eastAsia="Times New Roman" w:hAnsi="Arial" w:cs="Arial"/>
+                <w:color w:val="333399"/>
+                <w:sz w:val="18"/>
+                <w:szCs w:val="18"/>
+                <w:lang w:eastAsia="en-US"/>
+              </w:rPr>
+              <w:t>Sum of Squares</w:t>
+            </w:r>
+          </w:p>
+        </w:tc>
+        <w:tc>
+          <w:tcPr>
+            <w:tcW w:w="960" w:type="dxa"/>
+            <w:tcBorders>
+              <w:top w:val="nil"/>
+              <w:left w:val="nil"/>
+              <w:bottom w:val="single" w:sz="4" w:space="0" w:color="auto"/>
+              <w:right w:val="single" w:sz="4" w:space="0" w:color="auto"/>
+            </w:tcBorders>
+            <w:shd w:val="clear" w:color="auto" w:fill="auto"/>
+            <w:vAlign w:val="bottom"/>
+            <w:hideMark/>
+          </w:tcPr>
+          <w:p>
+            <w:pPr>
+              <w:jc w:val="center"/>
+              <w:rPr>
+                <w:rFonts w:ascii="Arial" w:eastAsia="Times New Roman" w:hAnsi="Arial" w:cs="Arial"/>
+                <w:color w:val="333399"/>
+                <w:sz w:val="18"/>
+                <w:szCs w:val="18"/>
+                <w:lang w:eastAsia="en-US"/>
+              </w:rPr>
+            </w:pPr>
+            <w:r>
+              <w:rPr>
+                <w:rFonts w:ascii="Arial" w:eastAsia="Times New Roman" w:hAnsi="Arial" w:cs="Arial"/>
+                <w:color w:val="333399"/>
+                <w:sz w:val="18"/>
+                <w:szCs w:val="18"/>
+                <w:lang w:eastAsia="en-US"/>
+              </w:rPr>
+              <w:t>df</w:t>
+            </w:r>
+          </w:p>
+        </w:tc>
+        <w:tc>
+          <w:tcPr>
+            <w:tcW w:w="960" w:type="dxa"/>
+            <w:tcBorders>
+              <w:top w:val="nil"/>
+              <w:left w:val="nil"/>
+              <w:bottom w:val="single" w:sz="4" w:space="0" w:color="auto"/>
+              <w:right w:val="single" w:sz="4" w:space="0" w:color="auto"/>
+            </w:tcBorders>
+            <w:shd w:val="clear" w:color="auto" w:fill="auto"/>
+            <w:vAlign w:val="bottom"/>
+            <w:hideMark/>
+          </w:tcPr>
+          <w:p>
+            <w:pPr>
+              <w:jc w:val="center"/>
+              <w:rPr>
+                <w:rFonts w:ascii="Arial" w:eastAsia="Times New Roman" w:hAnsi="Arial" w:cs="Arial"/>
+                <w:color w:val="333399"/>
+                <w:sz w:val="18"/>
+                <w:szCs w:val="18"/>
+                <w:lang w:eastAsia="en-US"/>
+              </w:rPr>
+            </w:pPr>
+            <w:r>
+              <w:rPr>
+                <w:rFonts w:ascii="Arial" w:eastAsia="Times New Roman" w:hAnsi="Arial" w:cs="Arial"/>
+                <w:color w:val="333399"/>
+                <w:sz w:val="18"/>
+                <w:szCs w:val="18"/>
+                <w:lang w:eastAsia="en-US"/>
+              </w:rPr>
+              <w:t>Mean Square</w:t>
+            </w:r>
+          </w:p>
+        </w:tc>
+        <w:tc>
+          <w:tcPr>
+            <w:tcW w:w="960" w:type="dxa"/>
+            <w:tcBorders>
+              <w:top w:val="nil"/>
+              <w:left w:val="nil"/>
+              <w:bottom w:val="single" w:sz="4" w:space="0" w:color="auto"/>
+              <w:right w:val="single" w:sz="4" w:space="0" w:color="auto"/>
+            </w:tcBorders>
+            <w:shd w:val="clear" w:color="auto" w:fill="auto"/>
+            <w:vAlign w:val="bottom"/>
+            <w:hideMark/>
+          </w:tcPr>
+          <w:p>
+            <w:pPr>
+              <w:jc w:val="center"/>
+              <w:rPr>
+                <w:rFonts w:ascii="Arial" w:eastAsia="Times New Roman" w:hAnsi="Arial" w:cs="Arial"/>
+                <w:color w:val="333399"/>
+                <w:sz w:val="18"/>
+                <w:szCs w:val="18"/>
+                <w:lang w:eastAsia="en-US"/>
+              </w:rPr>
+            </w:pPr>
+            <w:r>
+              <w:rPr>
+                <w:rFonts w:ascii="Arial" w:eastAsia="Times New Roman" w:hAnsi="Arial" w:cs="Arial"/>
+                <w:color w:val="333399"/>
+                <w:sz w:val="18"/>
+                <w:szCs w:val="18"/>
+                <w:lang w:eastAsia="en-US"/>
+              </w:rPr>
+              <w:t>F</w:t>
+            </w:r>
+          </w:p>
+        </w:tc>
+        <w:tc>
+          <w:tcPr>
+            <w:tcW w:w="960" w:type="dxa"/>
+            <w:tcBorders>
+              <w:top w:val="nil"/>
+              <w:left w:val="nil"/>
+              <w:bottom w:val="single" w:sz="4" w:space="0" w:color="auto"/>
+              <w:right w:val="single" w:sz="4" w:space="0" w:color="auto"/>
+            </w:tcBorders>
+            <w:shd w:val="clear" w:color="auto" w:fill="auto"/>
+            <w:vAlign w:val="bottom"/>
+            <w:hideMark/>
+          </w:tcPr>
+          <w:p>
+            <w:pPr>
+              <w:jc w:val="center"/>
+              <w:rPr>
+                <w:rFonts w:ascii="Arial" w:eastAsia="Times New Roman" w:hAnsi="Arial" w:cs="Arial"/>
+                <w:color w:val="333399"/>
+                <w:sz w:val="18"/>
+                <w:szCs w:val="18"/>
+                <w:lang w:eastAsia="en-US"/>
+              </w:rPr>
+            </w:pPr>
+            <w:r>
+              <w:rPr>
+                <w:rFonts w:ascii="Arial" w:eastAsia="Times New Roman" w:hAnsi="Arial" w:cs="Arial"/>
+                <w:color w:val="333399"/>
+                <w:sz w:val="18"/>
+                <w:szCs w:val="18"/>
+                <w:lang w:eastAsia="en-US"/>
+              </w:rPr>
+              <w:t>Sig.</w:t>
+            </w:r>
+          </w:p>
+        </w:tc>
+      </w:tr>
+      <w:tr>
+        <w:trPr>
+          <w:trHeight w:val="456"/>
+          <w:jc w:val="center"/>
+        </w:trPr>
+        <w:tc>
+          <w:tcPr>
+            <w:tcW w:w="960" w:type="dxa"/>
+            <w:tcBorders>
+              <w:top w:val="nil"/>
+              <w:left w:val="single" w:sz="4" w:space="0" w:color="auto"/>
+              <w:bottom w:val="single" w:sz="4" w:space="0" w:color="auto"/>
+              <w:right w:val="single" w:sz="4" w:space="0" w:color="auto"/>
+            </w:tcBorders>
+            <w:shd w:val="clear" w:color="000000" w:fill="CCCCFF"/>
+            <w:hideMark/>
+          </w:tcPr>
+          <w:p>
+            <w:pPr>
+              <w:rPr>
+                <w:rFonts w:ascii="Arial" w:eastAsia="Times New Roman" w:hAnsi="Arial" w:cs="Arial"/>
+                <w:color w:val="333399"/>
+                <w:sz w:val="18"/>
+                <w:szCs w:val="18"/>
+                <w:lang w:eastAsia="en-US"/>
+              </w:rPr>
+            </w:pPr>
+            <w:r>
+              <w:rPr>
+                <w:rFonts w:ascii="Arial" w:eastAsia="Times New Roman" w:hAnsi="Arial" w:cs="Arial"/>
+                <w:color w:val="333399"/>
+                <w:sz w:val="18"/>
+                <w:szCs w:val="18"/>
+                <w:lang w:eastAsia="en-US"/>
+              </w:rPr>
+              <w:t>Between Groups</w:t>
+            </w:r>
+          </w:p>
+        </w:tc>
+        <w:tc>
+          <w:tcPr>
+            <w:tcW w:w="960" w:type="dxa"/>
+            <w:tcBorders>
+              <w:top w:val="nil"/>
+              <w:left w:val="nil"/>
+              <w:bottom w:val="single" w:sz="4" w:space="0" w:color="auto"/>
+              <w:right w:val="single" w:sz="4" w:space="0" w:color="auto"/>
+            </w:tcBorders>
+            <w:shd w:val="clear" w:color="000000" w:fill="FFFFFF"/>
+            <w:noWrap/>
+            <w:hideMark/>
+          </w:tcPr>
+          <w:p>
+            <w:pPr>
+              <w:jc w:val="right"/>
+              <w:rPr>
+                <w:rFonts w:ascii="Arial" w:eastAsia="Times New Roman" w:hAnsi="Arial" w:cs="Arial"/>
+                <w:color w:val="993300"/>
+                <w:sz w:val="18"/>
+                <w:szCs w:val="18"/>
+                <w:lang w:eastAsia="en-US"/>
+              </w:rPr>
+            </w:pPr>
+            <w:r>
+              <w:rPr>
+                <w:rFonts w:ascii="Arial" w:eastAsia="Times New Roman" w:hAnsi="Arial" w:cs="Arial"/>
+                <w:color w:val="993300"/>
+                <w:sz w:val="18"/>
+                <w:szCs w:val="18"/>
+                <w:lang w:eastAsia="en-US"/>
+              </w:rPr>
+              <w:t>8.161</w:t>
+            </w:r>
+          </w:p>
+        </w:tc>
+        <w:tc>
+          <w:tcPr>
+            <w:tcW w:w="960" w:type="dxa"/>
+            <w:tcBorders>
+              <w:top w:val="nil"/>
+              <w:left w:val="nil"/>
+              <w:bottom w:val="single" w:sz="4" w:space="0" w:color="auto"/>
+              <w:right w:val="single" w:sz="4" w:space="0" w:color="auto"/>
+            </w:tcBorders>
+            <w:shd w:val="clear" w:color="000000" w:fill="FFFFFF"/>
+            <w:noWrap/>
+            <w:hideMark/>
+          </w:tcPr>
+          <w:p>
+            <w:pPr>
+              <w:jc w:val="right"/>
+              <w:rPr>
+                <w:rFonts w:ascii="Arial" w:eastAsia="Times New Roman" w:hAnsi="Arial" w:cs="Arial"/>
+                <w:color w:val="993300"/>
+                <w:sz w:val="18"/>
+                <w:szCs w:val="18"/>
+                <w:lang w:eastAsia="en-US"/>
+              </w:rPr>
+            </w:pPr>
+            <w:r>
+              <w:rPr>
+                <w:rFonts w:ascii="Arial" w:eastAsia="Times New Roman" w:hAnsi="Arial" w:cs="Arial"/>
+                <w:color w:val="993300"/>
+                <w:sz w:val="18"/>
+                <w:szCs w:val="18"/>
+                <w:lang w:eastAsia="en-US"/>
+              </w:rPr>
+              <w:t>6</w:t>
+            </w:r>
+          </w:p>
+        </w:tc>
+        <w:tc>
+          <w:tcPr>
+            <w:tcW w:w="960" w:type="dxa"/>
+            <w:tcBorders>
+              <w:top w:val="nil"/>
+              <w:left w:val="nil"/>
+              <w:bottom w:val="single" w:sz="4" w:space="0" w:color="auto"/>
+              <w:right w:val="single" w:sz="4" w:space="0" w:color="auto"/>
+            </w:tcBorders>
+            <w:shd w:val="clear" w:color="000000" w:fill="FFFFFF"/>
+            <w:noWrap/>
+            <w:hideMark/>
+          </w:tcPr>
+          <w:p>
+            <w:pPr>
+              <w:jc w:val="right"/>
+              <w:rPr>
+                <w:rFonts w:ascii="Arial" w:eastAsia="Times New Roman" w:hAnsi="Arial" w:cs="Arial"/>
+                <w:color w:val="993300"/>
+                <w:sz w:val="18"/>
+                <w:szCs w:val="18"/>
+                <w:lang w:eastAsia="en-US"/>
+              </w:rPr>
+            </w:pPr>
+            <w:r>
+              <w:rPr>
+                <w:rFonts w:ascii="Arial" w:eastAsia="Times New Roman" w:hAnsi="Arial" w:cs="Arial"/>
+                <w:color w:val="993300"/>
+                <w:sz w:val="18"/>
+                <w:szCs w:val="18"/>
+                <w:lang w:eastAsia="en-US"/>
+              </w:rPr>
+              <w:t>1.360</w:t>
+            </w:r>
+          </w:p>
+        </w:tc>
+        <w:tc>
+          <w:tcPr>
+            <w:tcW w:w="960" w:type="dxa"/>
+            <w:tcBorders>
+              <w:top w:val="nil"/>
+              <w:left w:val="nil"/>
+              <w:bottom w:val="single" w:sz="4" w:space="0" w:color="auto"/>
+              <w:right w:val="single" w:sz="4" w:space="0" w:color="auto"/>
+            </w:tcBorders>
+            <w:shd w:val="clear" w:color="000000" w:fill="FFFFFF"/>
+            <w:noWrap/>
+            <w:hideMark/>
+          </w:tcPr>
+          <w:p>
+            <w:pPr>
+              <w:jc w:val="right"/>
+              <w:rPr>
+                <w:rFonts w:ascii="Arial" w:eastAsia="Times New Roman" w:hAnsi="Arial" w:cs="Arial"/>
+                <w:color w:val="993300"/>
+                <w:sz w:val="18"/>
+                <w:szCs w:val="18"/>
+                <w:lang w:eastAsia="en-US"/>
+              </w:rPr>
+            </w:pPr>
+            <w:r>
+              <w:rPr>
+                <w:rFonts w:ascii="Arial" w:eastAsia="Times New Roman" w:hAnsi="Arial" w:cs="Arial"/>
+                <w:color w:val="993300"/>
+                <w:sz w:val="18"/>
+                <w:szCs w:val="18"/>
+                <w:lang w:eastAsia="en-US"/>
+              </w:rPr>
+              <w:t>1.871</w:t>
+            </w:r>
+          </w:p>
+        </w:tc>
+        <w:tc>
+          <w:tcPr>
+            <w:tcW w:w="960" w:type="dxa"/>
+            <w:tcBorders>
+              <w:top w:val="nil"/>
+              <w:left w:val="nil"/>
+              <w:bottom w:val="single" w:sz="4" w:space="0" w:color="auto"/>
+              <w:right w:val="single" w:sz="4" w:space="0" w:color="auto"/>
+            </w:tcBorders>
+            <w:shd w:val="clear" w:color="000000" w:fill="FFFFFF"/>
+            <w:noWrap/>
+            <w:hideMark/>
+          </w:tcPr>
+          <w:p>
+            <w:pPr>
+              <w:jc w:val="right"/>
+              <w:rPr>
+                <w:rFonts w:ascii="Arial" w:eastAsia="Times New Roman" w:hAnsi="Arial" w:cs="Arial"/>
+                <w:color w:val="993300"/>
+                <w:sz w:val="18"/>
+                <w:szCs w:val="18"/>
+                <w:lang w:eastAsia="en-US"/>
+              </w:rPr>
+            </w:pPr>
+            <w:r>
+              <w:rPr>
+                <w:rFonts w:ascii="Arial" w:eastAsia="Times New Roman" w:hAnsi="Arial" w:cs="Arial"/>
+                <w:color w:val="993300"/>
+                <w:sz w:val="18"/>
+                <w:szCs w:val="18"/>
+                <w:lang w:eastAsia="en-US"/>
+              </w:rPr>
+              <w:t>0.083</w:t>
+            </w:r>
+          </w:p>
+        </w:tc>
+      </w:tr>
+      <w:tr>
+        <w:trPr>
+          <w:trHeight w:val="456"/>
+          <w:jc w:val="center"/>
+        </w:trPr>
+        <w:tc>
+          <w:tcPr>
+            <w:tcW w:w="960" w:type="dxa"/>
+            <w:tcBorders>
+              <w:top w:val="nil"/>
+              <w:left w:val="single" w:sz="4" w:space="0" w:color="auto"/>
+              <w:bottom w:val="single" w:sz="4" w:space="0" w:color="auto"/>
+              <w:right w:val="single" w:sz="4" w:space="0" w:color="auto"/>
+            </w:tcBorders>
+            <w:shd w:val="clear" w:color="000000" w:fill="CCCCFF"/>
+            <w:hideMark/>
+          </w:tcPr>
+          <w:p>
+            <w:pPr>
+              <w:rPr>
+                <w:rFonts w:ascii="Arial" w:eastAsia="Times New Roman" w:hAnsi="Arial" w:cs="Arial"/>
+                <w:color w:val="333399"/>
+                <w:sz w:val="18"/>
+                <w:szCs w:val="18"/>
+                <w:lang w:eastAsia="en-US"/>
+              </w:rPr>
+            </w:pPr>
+            <w:r>
+              <w:rPr>
+                <w:rFonts w:ascii="Arial" w:eastAsia="Times New Roman" w:hAnsi="Arial" w:cs="Arial"/>
+                <w:color w:val="333399"/>
+                <w:sz w:val="18"/>
+                <w:szCs w:val="18"/>
+                <w:lang w:eastAsia="en-US"/>
+              </w:rPr>
+              <w:t>Within Groups</w:t>
+            </w:r>
+          </w:p>
+        </w:tc>
+        <w:tc>
+          <w:tcPr>
+            <w:tcW w:w="960" w:type="dxa"/>
+            <w:tcBorders>
+              <w:top w:val="nil"/>
+              <w:left w:val="nil"/>
+              <w:bottom w:val="single" w:sz="4" w:space="0" w:color="auto"/>
+              <w:right w:val="single" w:sz="4" w:space="0" w:color="auto"/>
+            </w:tcBorders>
+            <w:shd w:val="clear" w:color="000000" w:fill="FFFFFF"/>
+            <w:noWrap/>
+            <w:hideMark/>
+          </w:tcPr>
+          <w:p>
+            <w:pPr>
+              <w:jc w:val="right"/>
+              <w:rPr>
+                <w:rFonts w:ascii="Arial" w:eastAsia="Times New Roman" w:hAnsi="Arial" w:cs="Arial"/>
+                <w:color w:val="993300"/>
+                <w:sz w:val="18"/>
+                <w:szCs w:val="18"/>
+                <w:lang w:eastAsia="en-US"/>
+              </w:rPr>
+            </w:pPr>
+            <w:r>
+              <w:rPr>
+                <w:rFonts w:ascii="Arial" w:eastAsia="Times New Roman" w:hAnsi="Arial" w:cs="Arial"/>
+                <w:color w:val="993300"/>
+                <w:sz w:val="18"/>
+                <w:szCs w:val="18"/>
+                <w:lang w:eastAsia="en-US"/>
+              </w:rPr>
+              <w:t>696.391</w:t>
+            </w:r>
+          </w:p>
+        </w:tc>
+        <w:tc>
+          <w:tcPr>
+            <w:tcW w:w="960" w:type="dxa"/>
+            <w:tcBorders>
+              <w:top w:val="nil"/>
+              <w:left w:val="nil"/>
+              <w:bottom w:val="single" w:sz="4" w:space="0" w:color="auto"/>
+              <w:right w:val="single" w:sz="4" w:space="0" w:color="auto"/>
+            </w:tcBorders>
+            <w:shd w:val="clear" w:color="000000" w:fill="FFFFFF"/>
+            <w:noWrap/>
+            <w:hideMark/>
+          </w:tcPr>
+          <w:p>
+            <w:pPr>
+              <w:jc w:val="right"/>
+              <w:rPr>
+                <w:rFonts w:ascii="Arial" w:eastAsia="Times New Roman" w:hAnsi="Arial" w:cs="Arial"/>
+                <w:color w:val="993300"/>
+                <w:sz w:val="18"/>
+                <w:szCs w:val="18"/>
+                <w:lang w:eastAsia="en-US"/>
+              </w:rPr>
+            </w:pPr>
+            <w:r>
+              <w:rPr>
+                <w:rFonts w:ascii="Arial" w:eastAsia="Times New Roman" w:hAnsi="Arial" w:cs="Arial"/>
+                <w:color w:val="993300"/>
+                <w:sz w:val="18"/>
+                <w:szCs w:val="18"/>
+                <w:lang w:eastAsia="en-US"/>
+              </w:rPr>
+              <w:t>958</w:t>
+            </w:r>
+          </w:p>
+        </w:tc>
+        <w:tc>
+          <w:tcPr>
+            <w:tcW w:w="960" w:type="dxa"/>
+            <w:tcBorders>
+              <w:top w:val="nil"/>
+              <w:left w:val="nil"/>
+              <w:bottom w:val="single" w:sz="4" w:space="0" w:color="auto"/>
+              <w:right w:val="single" w:sz="4" w:space="0" w:color="auto"/>
+            </w:tcBorders>
+            <w:shd w:val="clear" w:color="000000" w:fill="FFFFFF"/>
+            <w:noWrap/>
+            <w:hideMark/>
+          </w:tcPr>
+          <w:p>
+            <w:pPr>
+              <w:jc w:val="right"/>
+              <w:rPr>
+                <w:rFonts w:ascii="Arial" w:eastAsia="Times New Roman" w:hAnsi="Arial" w:cs="Arial"/>
+                <w:color w:val="993300"/>
+                <w:sz w:val="18"/>
+                <w:szCs w:val="18"/>
+                <w:lang w:eastAsia="en-US"/>
+              </w:rPr>
+            </w:pPr>
+            <w:r>
+              <w:rPr>
+                <w:rFonts w:ascii="Arial" w:eastAsia="Times New Roman" w:hAnsi="Arial" w:cs="Arial"/>
+                <w:color w:val="993300"/>
+                <w:sz w:val="18"/>
+                <w:szCs w:val="18"/>
+                <w:lang w:eastAsia="en-US"/>
+              </w:rPr>
+              <w:t>0.727</w:t>
+            </w:r>
+          </w:p>
+        </w:tc>
+        <w:tc>
+          <w:tcPr>
+            <w:tcW w:w="960" w:type="dxa"/>
+            <w:tcBorders>
+              <w:top w:val="nil"/>
+              <w:left w:val="nil"/>
+              <w:bottom w:val="single" w:sz="4" w:space="0" w:color="auto"/>
+              <w:right w:val="single" w:sz="4" w:space="0" w:color="auto"/>
+            </w:tcBorders>
+            <w:shd w:val="clear" w:color="000000" w:fill="FFFFFF"/>
+            <w:hideMark/>
+          </w:tcPr>
+          <w:p>
+            <w:pPr>
+              <w:rPr>
+                <w:rFonts w:ascii="Arial" w:eastAsia="Times New Roman" w:hAnsi="Arial" w:cs="Arial"/>
+                <w:color w:val="993300"/>
+                <w:sz w:val="18"/>
+                <w:szCs w:val="18"/>
+                <w:lang w:eastAsia="en-US"/>
+              </w:rPr>
+            </w:pPr>
+            <w:r>
+              <w:rPr>
+                <w:rFonts w:ascii="Arial" w:eastAsia="Times New Roman" w:hAnsi="Arial" w:cs="Arial"/>
+                <w:color w:val="993300"/>
+                <w:sz w:val="18"/>
+                <w:szCs w:val="18"/>
+                <w:lang w:eastAsia="en-US"/>
+              </w:rPr>
+              <w:t> </w:t>
+            </w:r>
+          </w:p>
+        </w:tc>
+        <w:tc>
+          <w:tcPr>
+            <w:tcW w:w="960" w:type="dxa"/>
+            <w:tcBorders>
+              <w:top w:val="nil"/>
+              <w:left w:val="nil"/>
+              <w:bottom w:val="single" w:sz="4" w:space="0" w:color="auto"/>
+              <w:right w:val="single" w:sz="4" w:space="0" w:color="auto"/>
+            </w:tcBorders>
+            <w:shd w:val="clear" w:color="000000" w:fill="FFFFFF"/>
+            <w:hideMark/>
+          </w:tcPr>
+          <w:p>
+            <w:pPr>
+              <w:rPr>
+                <w:rFonts w:ascii="Arial" w:eastAsia="Times New Roman" w:hAnsi="Arial" w:cs="Arial"/>
+                <w:color w:val="993300"/>
+                <w:sz w:val="18"/>
+                <w:szCs w:val="18"/>
+                <w:lang w:eastAsia="en-US"/>
+              </w:rPr>
+            </w:pPr>
+            <w:r>
+              <w:rPr>
+                <w:rFonts w:ascii="Arial" w:eastAsia="Times New Roman" w:hAnsi="Arial" w:cs="Arial"/>
+                <w:color w:val="993300"/>
+                <w:sz w:val="18"/>
+                <w:szCs w:val="18"/>
+                <w:lang w:eastAsia="en-US"/>
+              </w:rPr>
+              <w:t> </w:t>
+            </w:r>
+          </w:p>
+        </w:tc>
+      </w:tr>
+      <w:tr>
+        <w:trPr>
+          <w:trHeight w:val="288"/>
+          <w:jc w:val="center"/>
+        </w:trPr>
+        <w:tc>
+          <w:tcPr>
+            <w:tcW w:w="960" w:type="dxa"/>
+            <w:tcBorders>
+              <w:top w:val="nil"/>
+              <w:left w:val="single" w:sz="4" w:space="0" w:color="auto"/>
+              <w:bottom w:val="single" w:sz="4" w:space="0" w:color="auto"/>
+              <w:right w:val="single" w:sz="4" w:space="0" w:color="auto"/>
+            </w:tcBorders>
+            <w:shd w:val="clear" w:color="000000" w:fill="CCCCFF"/>
+            <w:hideMark/>
+          </w:tcPr>
+          <w:p>
+            <w:pPr>
+              <w:rPr>
+                <w:rFonts w:ascii="Arial" w:eastAsia="Times New Roman" w:hAnsi="Arial" w:cs="Arial"/>
+                <w:color w:val="333399"/>
+                <w:sz w:val="18"/>
+                <w:szCs w:val="18"/>
+                <w:lang w:eastAsia="en-US"/>
+              </w:rPr>
+            </w:pPr>
+            <w:r>
+              <w:rPr>
+                <w:rFonts w:ascii="Arial" w:eastAsia="Times New Roman" w:hAnsi="Arial" w:cs="Arial"/>
+                <w:color w:val="333399"/>
+                <w:sz w:val="18"/>
+                <w:szCs w:val="18"/>
+                <w:lang w:eastAsia="en-US"/>
+              </w:rPr>
+              <w:t>Total</w:t>
+            </w:r>
+          </w:p>
+        </w:tc>
+        <w:tc>
+          <w:tcPr>
+            <w:tcW w:w="960" w:type="dxa"/>
+            <w:tcBorders>
+              <w:top w:val="nil"/>
+              <w:left w:val="nil"/>
+              <w:bottom w:val="single" w:sz="4" w:space="0" w:color="auto"/>
+              <w:right w:val="single" w:sz="4" w:space="0" w:color="auto"/>
+            </w:tcBorders>
+            <w:shd w:val="clear" w:color="000000" w:fill="FFFFFF"/>
+            <w:noWrap/>
+            <w:hideMark/>
+          </w:tcPr>
+          <w:p>
+            <w:pPr>
+              <w:jc w:val="right"/>
+              <w:rPr>
+                <w:rFonts w:ascii="Arial" w:eastAsia="Times New Roman" w:hAnsi="Arial" w:cs="Arial"/>
+                <w:color w:val="993300"/>
+                <w:sz w:val="18"/>
+                <w:szCs w:val="18"/>
+                <w:lang w:eastAsia="en-US"/>
+              </w:rPr>
+            </w:pPr>
+            <w:r>
+              <w:rPr>
+                <w:rFonts w:ascii="Arial" w:eastAsia="Times New Roman" w:hAnsi="Arial" w:cs="Arial"/>
+                <w:color w:val="993300"/>
+                <w:sz w:val="18"/>
+                <w:szCs w:val="18"/>
+                <w:lang w:eastAsia="en-US"/>
+              </w:rPr>
+              <w:t>704.552</w:t>
+            </w:r>
+          </w:p>
+        </w:tc>
+        <w:tc>
+          <w:tcPr>
+            <w:tcW w:w="960" w:type="dxa"/>
+            <w:tcBorders>
+              <w:top w:val="nil"/>
+              <w:left w:val="nil"/>
+              <w:bottom w:val="single" w:sz="4" w:space="0" w:color="auto"/>
+              <w:right w:val="single" w:sz="4" w:space="0" w:color="auto"/>
+            </w:tcBorders>
+            <w:shd w:val="clear" w:color="000000" w:fill="FFFFFF"/>
+            <w:noWrap/>
+            <w:hideMark/>
+          </w:tcPr>
+          <w:p>
+            <w:pPr>
+              <w:jc w:val="right"/>
+              <w:rPr>
+                <w:rFonts w:ascii="Arial" w:eastAsia="Times New Roman" w:hAnsi="Arial" w:cs="Arial"/>
+                <w:color w:val="993300"/>
+                <w:sz w:val="18"/>
+                <w:szCs w:val="18"/>
+                <w:lang w:eastAsia="en-US"/>
+              </w:rPr>
+            </w:pPr>
+            <w:r>
+              <w:rPr>
+                <w:rFonts w:ascii="Arial" w:eastAsia="Times New Roman" w:hAnsi="Arial" w:cs="Arial"/>
+                <w:color w:val="993300"/>
+                <w:sz w:val="18"/>
+                <w:szCs w:val="18"/>
+                <w:lang w:eastAsia="en-US"/>
+              </w:rPr>
+              <w:t>964</w:t>
+            </w:r>
+          </w:p>
+        </w:tc>
+        <w:tc>
+          <w:tcPr>
+            <w:tcW w:w="960" w:type="dxa"/>
+            <w:tcBorders>
+              <w:top w:val="nil"/>
+              <w:left w:val="nil"/>
+              <w:bottom w:val="single" w:sz="4" w:space="0" w:color="auto"/>
+              <w:right w:val="single" w:sz="4" w:space="0" w:color="auto"/>
+            </w:tcBorders>
+            <w:shd w:val="clear" w:color="000000" w:fill="FFFFFF"/>
+            <w:hideMark/>
+          </w:tcPr>
+          <w:p>
+            <w:pPr>
+              <w:rPr>
+                <w:rFonts w:ascii="Arial" w:eastAsia="Times New Roman" w:hAnsi="Arial" w:cs="Arial"/>
+                <w:color w:val="993300"/>
+                <w:sz w:val="18"/>
+                <w:szCs w:val="18"/>
+                <w:lang w:eastAsia="en-US"/>
+              </w:rPr>
+            </w:pPr>
+            <w:r>
+              <w:rPr>
+                <w:rFonts w:ascii="Arial" w:eastAsia="Times New Roman" w:hAnsi="Arial" w:cs="Arial"/>
+                <w:color w:val="993300"/>
+                <w:sz w:val="18"/>
+                <w:szCs w:val="18"/>
+                <w:lang w:eastAsia="en-US"/>
+              </w:rPr>
+              <w:t> </w:t>
+            </w:r>
+          </w:p>
+        </w:tc>
+        <w:tc>
+          <w:tcPr>
+            <w:tcW w:w="960" w:type="dxa"/>
+            <w:tcBorders>
+              <w:top w:val="nil"/>
+              <w:left w:val="nil"/>
+              <w:bottom w:val="single" w:sz="4" w:space="0" w:color="auto"/>
+              <w:right w:val="single" w:sz="4" w:space="0" w:color="auto"/>
+            </w:tcBorders>
+            <w:shd w:val="clear" w:color="000000" w:fill="FFFFFF"/>
+            <w:hideMark/>
+          </w:tcPr>
+          <w:p>
+            <w:pPr>
+              <w:rPr>
+                <w:rFonts w:ascii="Arial" w:eastAsia="Times New Roman" w:hAnsi="Arial" w:cs="Arial"/>
+                <w:color w:val="993300"/>
+                <w:sz w:val="18"/>
+                <w:szCs w:val="18"/>
+                <w:lang w:eastAsia="en-US"/>
+              </w:rPr>
+            </w:pPr>
+            <w:r>
+              <w:rPr>
+                <w:rFonts w:ascii="Arial" w:eastAsia="Times New Roman" w:hAnsi="Arial" w:cs="Arial"/>
+                <w:color w:val="993300"/>
+                <w:sz w:val="18"/>
+                <w:szCs w:val="18"/>
+                <w:lang w:eastAsia="en-US"/>
+              </w:rPr>
+              <w:t> </w:t>
+            </w:r>
+          </w:p>
+        </w:tc>
+        <w:tc>
+          <w:tcPr>
+            <w:tcW w:w="960" w:type="dxa"/>
+            <w:tcBorders>
+              <w:top w:val="nil"/>
+              <w:left w:val="nil"/>
+              <w:bottom w:val="single" w:sz="4" w:space="0" w:color="auto"/>
+              <w:right w:val="single" w:sz="4" w:space="0" w:color="auto"/>
+            </w:tcBorders>
+            <w:shd w:val="clear" w:color="000000" w:fill="FFFFFF"/>
+            <w:hideMark/>
+          </w:tcPr>
+          <w:p>
+            <w:pPr>
+              <w:rPr>
+                <w:rFonts w:ascii="Arial" w:eastAsia="Times New Roman" w:hAnsi="Arial" w:cs="Arial"/>
+                <w:color w:val="993300"/>
+                <w:sz w:val="18"/>
+                <w:szCs w:val="18"/>
+                <w:lang w:eastAsia="en-US"/>
+              </w:rPr>
+            </w:pPr>
+            <w:r>
+              <w:rPr>
+                <w:rFonts w:ascii="Arial" w:eastAsia="Times New Roman" w:hAnsi="Arial" w:cs="Arial"/>
+                <w:color w:val="993300"/>
+                <w:sz w:val="18"/>
+                <w:szCs w:val="18"/>
+                <w:lang w:eastAsia="en-US"/>
+              </w:rPr>
+              <w:t> </w:t>
+            </w:r>
+          </w:p>
+        </w:tc>
+      </w:tr>
+      <w:tr>
+        <w:trPr>
+          <w:trHeight w:val="288"/>
+          <w:jc w:val="center"/>
+        </w:trPr>
+        <w:tc>
+          <w:tcPr>
+            <w:tcW w:w="5760" w:type="dxa"/>
+            <w:gridSpan w:val="6"/>
+            <w:tcBorders>
+              <w:top w:val="single" w:sz="4" w:space="0" w:color="auto"/>
+              <w:left w:val="single" w:sz="4" w:space="0" w:color="auto"/>
+              <w:bottom w:val="single" w:sz="4" w:space="0" w:color="auto"/>
+              <w:right w:val="single" w:sz="4" w:space="0" w:color="auto"/>
+            </w:tcBorders>
+            <w:shd w:val="clear" w:color="000000" w:fill="FFFFFF"/>
+            <w:noWrap/>
+            <w:vAlign w:val="bottom"/>
+            <w:hideMark/>
+          </w:tcPr>
+          <w:p>
+            <w:pPr>
+              <w:jc w:val="center"/>
               <w:rPr>
                 <w:rFonts w:ascii="Arial" w:eastAsia="Times New Roman" w:hAnsi="Arial" w:cs="Arial"/>
                 <w:b/>
@@ -3367,7 +4084,18 @@
                 <w:szCs w:val="18"/>
                 <w:lang w:eastAsia="en-US"/>
               </w:rPr>
-              <w:t xml:space="preserve"> &amp; level of education</w:t>
+            </w:pPr>
+            <w:r>
+              <w:rPr>
+                <w:rFonts w:ascii="Arial" w:eastAsia="Times New Roman" w:hAnsi="Arial" w:cs="Arial"/>
+                <w:b/>
+                <w:bCs/>
+                <w:color w:val="993300"/>
+                <w:sz w:val="18"/>
+                <w:szCs w:val="18"/>
+                <w:lang w:eastAsia="en-US"/>
+              </w:rPr>
+              <w:t>tolerance_index &amp; level of education</w:t>
             </w:r>
           </w:p>
         </w:tc>
@@ -3472,7 +4200,6 @@
                 <w:lang w:eastAsia="en-US"/>
               </w:rPr>
             </w:pPr>
-            <w:proofErr w:type="spellStart"/>
             <w:r>
               <w:rPr>
                 <w:rFonts w:ascii="Arial" w:eastAsia="Times New Roman" w:hAnsi="Arial" w:cs="Arial"/>
@@ -3483,7 +4210,6 @@
               </w:rPr>
               <w:t>df</w:t>
             </w:r>
-            <w:proofErr w:type="spellEnd"/>
           </w:p>
         </w:tc>
         <w:tc>
@@ -3666,7 +4392,7 @@
                 <w:szCs w:val="18"/>
                 <w:lang w:eastAsia="en-US"/>
               </w:rPr>
-              <w:t>8.161</w:t>
+              <w:t>34.625</w:t>
             </w:r>
           </w:p>
         </w:tc>
@@ -3738,7 +4464,7 @@
                 <w:szCs w:val="18"/>
                 <w:lang w:eastAsia="en-US"/>
               </w:rPr>
-              <w:t>1.360</w:t>
+              <w:t>5.771</w:t>
             </w:r>
           </w:p>
         </w:tc>
@@ -3774,7 +4500,7 @@
                 <w:szCs w:val="18"/>
                 <w:lang w:eastAsia="en-US"/>
               </w:rPr>
-              <w:t>1.871</w:t>
+              <w:t>7.607</w:t>
             </w:r>
           </w:p>
         </w:tc>
@@ -3810,7 +4536,7 @@
                 <w:szCs w:val="18"/>
                 <w:lang w:eastAsia="en-US"/>
               </w:rPr>
-              <w:t>0.083</w:t>
+              <w:t>0.000</w:t>
             </w:r>
           </w:p>
         </w:tc>
@@ -3886,7 +4612,7 @@
                 <w:szCs w:val="18"/>
                 <w:lang w:eastAsia="en-US"/>
               </w:rPr>
-              <w:t>696.391</w:t>
+              <w:t>755.619</w:t>
             </w:r>
           </w:p>
         </w:tc>
@@ -3922,7 +4648,7 @@
                 <w:szCs w:val="18"/>
                 <w:lang w:eastAsia="en-US"/>
               </w:rPr>
-              <w:t>958</w:t>
+              <w:t>996</w:t>
             </w:r>
           </w:p>
         </w:tc>
@@ -3958,7 +4684,7 @@
                 <w:szCs w:val="18"/>
                 <w:lang w:eastAsia="en-US"/>
               </w:rPr>
-              <w:t>0.727</w:t>
+              <w:t>0.759</w:t>
             </w:r>
           </w:p>
         </w:tc>
@@ -4102,7 +4828,7 @@
                 <w:szCs w:val="18"/>
                 <w:lang w:eastAsia="en-US"/>
               </w:rPr>
-              <w:t>704.552</w:t>
+              <w:t>790.244</w:t>
             </w:r>
           </w:p>
         </w:tc>
@@ -4138,7 +4864,7 @@
                 <w:szCs w:val="18"/>
                 <w:lang w:eastAsia="en-US"/>
               </w:rPr>
-              <w:t>964</w:t>
+              <w:t>1002</w:t>
             </w:r>
           </w:p>
         </w:tc>
@@ -4278,7 +5004,6 @@
                 <w:lang w:eastAsia="en-US"/>
               </w:rPr>
             </w:pPr>
-            <w:proofErr w:type="spellStart"/>
             <w:r>
               <w:rPr>
                 <w:rFonts w:ascii="Arial" w:eastAsia="Times New Roman" w:hAnsi="Arial" w:cs="Arial"/>
@@ -4289,20 +5014,7 @@
                 <w:szCs w:val="18"/>
                 <w:lang w:eastAsia="en-US"/>
               </w:rPr>
-              <w:t>tolerance_index</w:t>
-            </w:r>
-            <w:proofErr w:type="spellEnd"/>
-            <w:r>
-              <w:rPr>
-                <w:rFonts w:ascii="Arial" w:eastAsia="Times New Roman" w:hAnsi="Arial" w:cs="Arial"/>
-                <w:b/>
-                <w:bCs/>
-                <w:color w:val="993300"/>
-                <w:sz w:val="18"/>
-                <w:szCs w:val="18"/>
-                <w:lang w:eastAsia="en-US"/>
-              </w:rPr>
-              <w:t xml:space="preserve"> &amp; level of education</w:t>
+              <w:t>experience_index &amp; level of education</w:t>
             </w:r>
           </w:p>
         </w:tc>
@@ -4407,7 +5119,6 @@
                 <w:lang w:eastAsia="en-US"/>
               </w:rPr>
             </w:pPr>
-            <w:proofErr w:type="spellStart"/>
             <w:r>
               <w:rPr>
                 <w:rFonts w:ascii="Arial" w:eastAsia="Times New Roman" w:hAnsi="Arial" w:cs="Arial"/>
@@ -4418,942 +5129,6 @@
               </w:rPr>
               <w:t>df</w:t>
             </w:r>
-            <w:proofErr w:type="spellEnd"/>
-          </w:p>
-        </w:tc>
-        <w:tc>
-          <w:tcPr>
-            <w:tcW w:w="960" w:type="dxa"/>
-            <w:tcBorders>
-              <w:top w:val="nil"/>
-              <w:left w:val="nil"/>
-              <w:bottom w:val="single" w:sz="4" w:space="0" w:color="auto"/>
-              <w:right w:val="single" w:sz="4" w:space="0" w:color="auto"/>
-            </w:tcBorders>
-            <w:shd w:val="clear" w:color="auto" w:fill="auto"/>
-            <w:vAlign w:val="bottom"/>
-            <w:hideMark/>
-          </w:tcPr>
-          <w:p>
-            <w:pPr>
-              <w:jc w:val="center"/>
-              <w:rPr>
-                <w:rFonts w:ascii="Arial" w:eastAsia="Times New Roman" w:hAnsi="Arial" w:cs="Arial"/>
-                <w:color w:val="333399"/>
-                <w:sz w:val="18"/>
-                <w:szCs w:val="18"/>
-                <w:lang w:eastAsia="en-US"/>
-              </w:rPr>
-            </w:pPr>
-            <w:r>
-              <w:rPr>
-                <w:rFonts w:ascii="Arial" w:eastAsia="Times New Roman" w:hAnsi="Arial" w:cs="Arial"/>
-                <w:color w:val="333399"/>
-                <w:sz w:val="18"/>
-                <w:szCs w:val="18"/>
-                <w:lang w:eastAsia="en-US"/>
-              </w:rPr>
-              <w:t>Mean Square</w:t>
-            </w:r>
-          </w:p>
-        </w:tc>
-        <w:tc>
-          <w:tcPr>
-            <w:tcW w:w="960" w:type="dxa"/>
-            <w:tcBorders>
-              <w:top w:val="nil"/>
-              <w:left w:val="nil"/>
-              <w:bottom w:val="single" w:sz="4" w:space="0" w:color="auto"/>
-              <w:right w:val="single" w:sz="4" w:space="0" w:color="auto"/>
-            </w:tcBorders>
-            <w:shd w:val="clear" w:color="auto" w:fill="auto"/>
-            <w:vAlign w:val="bottom"/>
-            <w:hideMark/>
-          </w:tcPr>
-          <w:p>
-            <w:pPr>
-              <w:jc w:val="center"/>
-              <w:rPr>
-                <w:rFonts w:ascii="Arial" w:eastAsia="Times New Roman" w:hAnsi="Arial" w:cs="Arial"/>
-                <w:color w:val="333399"/>
-                <w:sz w:val="18"/>
-                <w:szCs w:val="18"/>
-                <w:lang w:eastAsia="en-US"/>
-              </w:rPr>
-            </w:pPr>
-            <w:r>
-              <w:rPr>
-                <w:rFonts w:ascii="Arial" w:eastAsia="Times New Roman" w:hAnsi="Arial" w:cs="Arial"/>
-                <w:color w:val="333399"/>
-                <w:sz w:val="18"/>
-                <w:szCs w:val="18"/>
-                <w:lang w:eastAsia="en-US"/>
-              </w:rPr>
-              <w:t>F</w:t>
-            </w:r>
-          </w:p>
-        </w:tc>
-        <w:tc>
-          <w:tcPr>
-            <w:tcW w:w="960" w:type="dxa"/>
-            <w:tcBorders>
-              <w:top w:val="nil"/>
-              <w:left w:val="nil"/>
-              <w:bottom w:val="single" w:sz="4" w:space="0" w:color="auto"/>
-              <w:right w:val="single" w:sz="4" w:space="0" w:color="auto"/>
-            </w:tcBorders>
-            <w:shd w:val="clear" w:color="auto" w:fill="auto"/>
-            <w:vAlign w:val="bottom"/>
-            <w:hideMark/>
-          </w:tcPr>
-          <w:p>
-            <w:pPr>
-              <w:jc w:val="center"/>
-              <w:rPr>
-                <w:rFonts w:ascii="Arial" w:eastAsia="Times New Roman" w:hAnsi="Arial" w:cs="Arial"/>
-                <w:color w:val="333399"/>
-                <w:sz w:val="18"/>
-                <w:szCs w:val="18"/>
-                <w:lang w:eastAsia="en-US"/>
-              </w:rPr>
-            </w:pPr>
-            <w:r>
-              <w:rPr>
-                <w:rFonts w:ascii="Arial" w:eastAsia="Times New Roman" w:hAnsi="Arial" w:cs="Arial"/>
-                <w:color w:val="333399"/>
-                <w:sz w:val="18"/>
-                <w:szCs w:val="18"/>
-                <w:lang w:eastAsia="en-US"/>
-              </w:rPr>
-              <w:t>Sig.</w:t>
-            </w:r>
-          </w:p>
-        </w:tc>
-      </w:tr>
-      <w:tr>
-        <w:trPr>
-          <w:trHeight w:val="456"/>
-          <w:jc w:val="center"/>
-        </w:trPr>
-        <w:tc>
-          <w:tcPr>
-            <w:tcW w:w="960" w:type="dxa"/>
-            <w:tcBorders>
-              <w:top w:val="nil"/>
-              <w:left w:val="single" w:sz="4" w:space="0" w:color="auto"/>
-              <w:bottom w:val="single" w:sz="4" w:space="0" w:color="auto"/>
-              <w:right w:val="single" w:sz="4" w:space="0" w:color="auto"/>
-            </w:tcBorders>
-            <w:shd w:val="clear" w:color="000000" w:fill="CCCCFF"/>
-            <w:hideMark/>
-          </w:tcPr>
-          <w:p>
-            <w:pPr>
-              <w:rPr>
-                <w:rFonts w:ascii="Arial" w:eastAsia="Times New Roman" w:hAnsi="Arial" w:cs="Arial"/>
-                <w:color w:val="333399"/>
-                <w:sz w:val="18"/>
-                <w:szCs w:val="18"/>
-                <w:lang w:eastAsia="en-US"/>
-              </w:rPr>
-            </w:pPr>
-            <w:r>
-              <w:rPr>
-                <w:rFonts w:ascii="Arial" w:eastAsia="Times New Roman" w:hAnsi="Arial" w:cs="Arial"/>
-                <w:color w:val="333399"/>
-                <w:sz w:val="18"/>
-                <w:szCs w:val="18"/>
-                <w:lang w:eastAsia="en-US"/>
-              </w:rPr>
-              <w:t>Between Groups</w:t>
-            </w:r>
-          </w:p>
-        </w:tc>
-        <w:tc>
-          <w:tcPr>
-            <w:tcW w:w="960" w:type="dxa"/>
-            <w:tcBorders>
-              <w:top w:val="nil"/>
-              <w:left w:val="nil"/>
-              <w:bottom w:val="single" w:sz="4" w:space="0" w:color="auto"/>
-              <w:right w:val="single" w:sz="4" w:space="0" w:color="auto"/>
-            </w:tcBorders>
-            <w:shd w:val="clear" w:color="000000" w:fill="FFFFFF"/>
-            <w:noWrap/>
-            <w:hideMark/>
-          </w:tcPr>
-          <w:p>
-            <w:pPr>
-              <w:jc w:val="right"/>
-              <w:rPr>
-                <w:rFonts w:ascii="Arial" w:eastAsia="Times New Roman" w:hAnsi="Arial" w:cs="Arial"/>
-                <w:color w:val="993300"/>
-                <w:sz w:val="18"/>
-                <w:szCs w:val="18"/>
-                <w:lang w:eastAsia="en-US"/>
-              </w:rPr>
-            </w:pPr>
-            <w:r>
-              <w:rPr>
-                <w:rFonts w:ascii="Arial" w:eastAsia="Times New Roman" w:hAnsi="Arial" w:cs="Arial"/>
-                <w:color w:val="993300"/>
-                <w:sz w:val="18"/>
-                <w:szCs w:val="18"/>
-                <w:lang w:eastAsia="en-US"/>
-              </w:rPr>
-              <w:t>34.625</w:t>
-            </w:r>
-          </w:p>
-        </w:tc>
-        <w:tc>
-          <w:tcPr>
-            <w:tcW w:w="960" w:type="dxa"/>
-            <w:tcBorders>
-              <w:top w:val="nil"/>
-              <w:left w:val="nil"/>
-              <w:bottom w:val="single" w:sz="4" w:space="0" w:color="auto"/>
-              <w:right w:val="single" w:sz="4" w:space="0" w:color="auto"/>
-            </w:tcBorders>
-            <w:shd w:val="clear" w:color="000000" w:fill="FFFFFF"/>
-            <w:noWrap/>
-            <w:hideMark/>
-          </w:tcPr>
-          <w:p>
-            <w:pPr>
-              <w:jc w:val="right"/>
-              <w:rPr>
-                <w:rFonts w:ascii="Arial" w:eastAsia="Times New Roman" w:hAnsi="Arial" w:cs="Arial"/>
-                <w:color w:val="993300"/>
-                <w:sz w:val="18"/>
-                <w:szCs w:val="18"/>
-                <w:lang w:eastAsia="en-US"/>
-              </w:rPr>
-            </w:pPr>
-            <w:r>
-              <w:rPr>
-                <w:rFonts w:ascii="Arial" w:eastAsia="Times New Roman" w:hAnsi="Arial" w:cs="Arial"/>
-                <w:color w:val="993300"/>
-                <w:sz w:val="18"/>
-                <w:szCs w:val="18"/>
-                <w:lang w:eastAsia="en-US"/>
-              </w:rPr>
-              <w:t>6</w:t>
-            </w:r>
-          </w:p>
-        </w:tc>
-        <w:tc>
-          <w:tcPr>
-            <w:tcW w:w="960" w:type="dxa"/>
-            <w:tcBorders>
-              <w:top w:val="nil"/>
-              <w:left w:val="nil"/>
-              <w:bottom w:val="single" w:sz="4" w:space="0" w:color="auto"/>
-              <w:right w:val="single" w:sz="4" w:space="0" w:color="auto"/>
-            </w:tcBorders>
-            <w:shd w:val="clear" w:color="000000" w:fill="FFFFFF"/>
-            <w:noWrap/>
-            <w:hideMark/>
-          </w:tcPr>
-          <w:p>
-            <w:pPr>
-              <w:jc w:val="right"/>
-              <w:rPr>
-                <w:rFonts w:ascii="Arial" w:eastAsia="Times New Roman" w:hAnsi="Arial" w:cs="Arial"/>
-                <w:color w:val="993300"/>
-                <w:sz w:val="18"/>
-                <w:szCs w:val="18"/>
-                <w:lang w:eastAsia="en-US"/>
-              </w:rPr>
-            </w:pPr>
-            <w:r>
-              <w:rPr>
-                <w:rFonts w:ascii="Arial" w:eastAsia="Times New Roman" w:hAnsi="Arial" w:cs="Arial"/>
-                <w:color w:val="993300"/>
-                <w:sz w:val="18"/>
-                <w:szCs w:val="18"/>
-                <w:lang w:eastAsia="en-US"/>
-              </w:rPr>
-              <w:t>5.771</w:t>
-            </w:r>
-          </w:p>
-        </w:tc>
-        <w:tc>
-          <w:tcPr>
-            <w:tcW w:w="960" w:type="dxa"/>
-            <w:tcBorders>
-              <w:top w:val="nil"/>
-              <w:left w:val="nil"/>
-              <w:bottom w:val="single" w:sz="4" w:space="0" w:color="auto"/>
-              <w:right w:val="single" w:sz="4" w:space="0" w:color="auto"/>
-            </w:tcBorders>
-            <w:shd w:val="clear" w:color="000000" w:fill="FFFFFF"/>
-            <w:noWrap/>
-            <w:hideMark/>
-          </w:tcPr>
-          <w:p>
-            <w:pPr>
-              <w:jc w:val="right"/>
-              <w:rPr>
-                <w:rFonts w:ascii="Arial" w:eastAsia="Times New Roman" w:hAnsi="Arial" w:cs="Arial"/>
-                <w:color w:val="993300"/>
-                <w:sz w:val="18"/>
-                <w:szCs w:val="18"/>
-                <w:lang w:eastAsia="en-US"/>
-              </w:rPr>
-            </w:pPr>
-            <w:r>
-              <w:rPr>
-                <w:rFonts w:ascii="Arial" w:eastAsia="Times New Roman" w:hAnsi="Arial" w:cs="Arial"/>
-                <w:color w:val="993300"/>
-                <w:sz w:val="18"/>
-                <w:szCs w:val="18"/>
-                <w:lang w:eastAsia="en-US"/>
-              </w:rPr>
-              <w:t>7.607</w:t>
-            </w:r>
-          </w:p>
-        </w:tc>
-        <w:tc>
-          <w:tcPr>
-            <w:tcW w:w="960" w:type="dxa"/>
-            <w:tcBorders>
-              <w:top w:val="nil"/>
-              <w:left w:val="nil"/>
-              <w:bottom w:val="single" w:sz="4" w:space="0" w:color="auto"/>
-              <w:right w:val="single" w:sz="4" w:space="0" w:color="auto"/>
-            </w:tcBorders>
-            <w:shd w:val="clear" w:color="000000" w:fill="FFFFFF"/>
-            <w:noWrap/>
-            <w:hideMark/>
-          </w:tcPr>
-          <w:p>
-            <w:pPr>
-              <w:jc w:val="right"/>
-              <w:rPr>
-                <w:rFonts w:ascii="Arial" w:eastAsia="Times New Roman" w:hAnsi="Arial" w:cs="Arial"/>
-                <w:color w:val="993300"/>
-                <w:sz w:val="18"/>
-                <w:szCs w:val="18"/>
-                <w:lang w:eastAsia="en-US"/>
-              </w:rPr>
-            </w:pPr>
-            <w:r>
-              <w:rPr>
-                <w:rFonts w:ascii="Arial" w:eastAsia="Times New Roman" w:hAnsi="Arial" w:cs="Arial"/>
-                <w:color w:val="993300"/>
-                <w:sz w:val="18"/>
-                <w:szCs w:val="18"/>
-                <w:lang w:eastAsia="en-US"/>
-              </w:rPr>
-              <w:t>0.000</w:t>
-            </w:r>
-          </w:p>
-        </w:tc>
-      </w:tr>
-      <w:tr>
-        <w:trPr>
-          <w:trHeight w:val="456"/>
-          <w:jc w:val="center"/>
-        </w:trPr>
-        <w:tc>
-          <w:tcPr>
-            <w:tcW w:w="960" w:type="dxa"/>
-            <w:tcBorders>
-              <w:top w:val="nil"/>
-              <w:left w:val="single" w:sz="4" w:space="0" w:color="auto"/>
-              <w:bottom w:val="single" w:sz="4" w:space="0" w:color="auto"/>
-              <w:right w:val="single" w:sz="4" w:space="0" w:color="auto"/>
-            </w:tcBorders>
-            <w:shd w:val="clear" w:color="000000" w:fill="CCCCFF"/>
-            <w:hideMark/>
-          </w:tcPr>
-          <w:p>
-            <w:pPr>
-              <w:rPr>
-                <w:rFonts w:ascii="Arial" w:eastAsia="Times New Roman" w:hAnsi="Arial" w:cs="Arial"/>
-                <w:color w:val="333399"/>
-                <w:sz w:val="18"/>
-                <w:szCs w:val="18"/>
-                <w:lang w:eastAsia="en-US"/>
-              </w:rPr>
-            </w:pPr>
-            <w:r>
-              <w:rPr>
-                <w:rFonts w:ascii="Arial" w:eastAsia="Times New Roman" w:hAnsi="Arial" w:cs="Arial"/>
-                <w:color w:val="333399"/>
-                <w:sz w:val="18"/>
-                <w:szCs w:val="18"/>
-                <w:lang w:eastAsia="en-US"/>
-              </w:rPr>
-              <w:t>Within Groups</w:t>
-            </w:r>
-          </w:p>
-        </w:tc>
-        <w:tc>
-          <w:tcPr>
-            <w:tcW w:w="960" w:type="dxa"/>
-            <w:tcBorders>
-              <w:top w:val="nil"/>
-              <w:left w:val="nil"/>
-              <w:bottom w:val="single" w:sz="4" w:space="0" w:color="auto"/>
-              <w:right w:val="single" w:sz="4" w:space="0" w:color="auto"/>
-            </w:tcBorders>
-            <w:shd w:val="clear" w:color="000000" w:fill="FFFFFF"/>
-            <w:noWrap/>
-            <w:hideMark/>
-          </w:tcPr>
-          <w:p>
-            <w:pPr>
-              <w:jc w:val="right"/>
-              <w:rPr>
-                <w:rFonts w:ascii="Arial" w:eastAsia="Times New Roman" w:hAnsi="Arial" w:cs="Arial"/>
-                <w:color w:val="993300"/>
-                <w:sz w:val="18"/>
-                <w:szCs w:val="18"/>
-                <w:lang w:eastAsia="en-US"/>
-              </w:rPr>
-            </w:pPr>
-            <w:r>
-              <w:rPr>
-                <w:rFonts w:ascii="Arial" w:eastAsia="Times New Roman" w:hAnsi="Arial" w:cs="Arial"/>
-                <w:color w:val="993300"/>
-                <w:sz w:val="18"/>
-                <w:szCs w:val="18"/>
-                <w:lang w:eastAsia="en-US"/>
-              </w:rPr>
-              <w:t>755.619</w:t>
-            </w:r>
-          </w:p>
-        </w:tc>
-        <w:tc>
-          <w:tcPr>
-            <w:tcW w:w="960" w:type="dxa"/>
-            <w:tcBorders>
-              <w:top w:val="nil"/>
-              <w:left w:val="nil"/>
-              <w:bottom w:val="single" w:sz="4" w:space="0" w:color="auto"/>
-              <w:right w:val="single" w:sz="4" w:space="0" w:color="auto"/>
-            </w:tcBorders>
-            <w:shd w:val="clear" w:color="000000" w:fill="FFFFFF"/>
-            <w:noWrap/>
-            <w:hideMark/>
-          </w:tcPr>
-          <w:p>
-            <w:pPr>
-              <w:jc w:val="right"/>
-              <w:rPr>
-                <w:rFonts w:ascii="Arial" w:eastAsia="Times New Roman" w:hAnsi="Arial" w:cs="Arial"/>
-                <w:color w:val="993300"/>
-                <w:sz w:val="18"/>
-                <w:szCs w:val="18"/>
-                <w:lang w:eastAsia="en-US"/>
-              </w:rPr>
-            </w:pPr>
-            <w:r>
-              <w:rPr>
-                <w:rFonts w:ascii="Arial" w:eastAsia="Times New Roman" w:hAnsi="Arial" w:cs="Arial"/>
-                <w:color w:val="993300"/>
-                <w:sz w:val="18"/>
-                <w:szCs w:val="18"/>
-                <w:lang w:eastAsia="en-US"/>
-              </w:rPr>
-              <w:t>996</w:t>
-            </w:r>
-          </w:p>
-        </w:tc>
-        <w:tc>
-          <w:tcPr>
-            <w:tcW w:w="960" w:type="dxa"/>
-            <w:tcBorders>
-              <w:top w:val="nil"/>
-              <w:left w:val="nil"/>
-              <w:bottom w:val="single" w:sz="4" w:space="0" w:color="auto"/>
-              <w:right w:val="single" w:sz="4" w:space="0" w:color="auto"/>
-            </w:tcBorders>
-            <w:shd w:val="clear" w:color="000000" w:fill="FFFFFF"/>
-            <w:noWrap/>
-            <w:hideMark/>
-          </w:tcPr>
-          <w:p>
-            <w:pPr>
-              <w:jc w:val="right"/>
-              <w:rPr>
-                <w:rFonts w:ascii="Arial" w:eastAsia="Times New Roman" w:hAnsi="Arial" w:cs="Arial"/>
-                <w:color w:val="993300"/>
-                <w:sz w:val="18"/>
-                <w:szCs w:val="18"/>
-                <w:lang w:eastAsia="en-US"/>
-              </w:rPr>
-            </w:pPr>
-            <w:r>
-              <w:rPr>
-                <w:rFonts w:ascii="Arial" w:eastAsia="Times New Roman" w:hAnsi="Arial" w:cs="Arial"/>
-                <w:color w:val="993300"/>
-                <w:sz w:val="18"/>
-                <w:szCs w:val="18"/>
-                <w:lang w:eastAsia="en-US"/>
-              </w:rPr>
-              <w:t>0.759</w:t>
-            </w:r>
-          </w:p>
-        </w:tc>
-        <w:tc>
-          <w:tcPr>
-            <w:tcW w:w="960" w:type="dxa"/>
-            <w:tcBorders>
-              <w:top w:val="nil"/>
-              <w:left w:val="nil"/>
-              <w:bottom w:val="single" w:sz="4" w:space="0" w:color="auto"/>
-              <w:right w:val="single" w:sz="4" w:space="0" w:color="auto"/>
-            </w:tcBorders>
-            <w:shd w:val="clear" w:color="000000" w:fill="FFFFFF"/>
-            <w:hideMark/>
-          </w:tcPr>
-          <w:p>
-            <w:pPr>
-              <w:rPr>
-                <w:rFonts w:ascii="Arial" w:eastAsia="Times New Roman" w:hAnsi="Arial" w:cs="Arial"/>
-                <w:color w:val="993300"/>
-                <w:sz w:val="18"/>
-                <w:szCs w:val="18"/>
-                <w:lang w:eastAsia="en-US"/>
-              </w:rPr>
-            </w:pPr>
-            <w:r>
-              <w:rPr>
-                <w:rFonts w:ascii="Arial" w:eastAsia="Times New Roman" w:hAnsi="Arial" w:cs="Arial"/>
-                <w:color w:val="993300"/>
-                <w:sz w:val="18"/>
-                <w:szCs w:val="18"/>
-                <w:lang w:eastAsia="en-US"/>
-              </w:rPr>
-              <w:t> </w:t>
-            </w:r>
-          </w:p>
-        </w:tc>
-        <w:tc>
-          <w:tcPr>
-            <w:tcW w:w="960" w:type="dxa"/>
-            <w:tcBorders>
-              <w:top w:val="nil"/>
-              <w:left w:val="nil"/>
-              <w:bottom w:val="single" w:sz="4" w:space="0" w:color="auto"/>
-              <w:right w:val="single" w:sz="4" w:space="0" w:color="auto"/>
-            </w:tcBorders>
-            <w:shd w:val="clear" w:color="000000" w:fill="FFFFFF"/>
-            <w:hideMark/>
-          </w:tcPr>
-          <w:p>
-            <w:pPr>
-              <w:rPr>
-                <w:rFonts w:ascii="Arial" w:eastAsia="Times New Roman" w:hAnsi="Arial" w:cs="Arial"/>
-                <w:color w:val="993300"/>
-                <w:sz w:val="18"/>
-                <w:szCs w:val="18"/>
-                <w:lang w:eastAsia="en-US"/>
-              </w:rPr>
-            </w:pPr>
-            <w:r>
-              <w:rPr>
-                <w:rFonts w:ascii="Arial" w:eastAsia="Times New Roman" w:hAnsi="Arial" w:cs="Arial"/>
-                <w:color w:val="993300"/>
-                <w:sz w:val="18"/>
-                <w:szCs w:val="18"/>
-                <w:lang w:eastAsia="en-US"/>
-              </w:rPr>
-              <w:t> </w:t>
-            </w:r>
-          </w:p>
-        </w:tc>
-      </w:tr>
-      <w:tr>
-        <w:trPr>
-          <w:trHeight w:val="288"/>
-          <w:jc w:val="center"/>
-        </w:trPr>
-        <w:tc>
-          <w:tcPr>
-            <w:tcW w:w="960" w:type="dxa"/>
-            <w:tcBorders>
-              <w:top w:val="nil"/>
-              <w:left w:val="single" w:sz="4" w:space="0" w:color="auto"/>
-              <w:bottom w:val="single" w:sz="4" w:space="0" w:color="auto"/>
-              <w:right w:val="single" w:sz="4" w:space="0" w:color="auto"/>
-            </w:tcBorders>
-            <w:shd w:val="clear" w:color="000000" w:fill="CCCCFF"/>
-            <w:hideMark/>
-          </w:tcPr>
-          <w:p>
-            <w:pPr>
-              <w:rPr>
-                <w:rFonts w:ascii="Arial" w:eastAsia="Times New Roman" w:hAnsi="Arial" w:cs="Arial"/>
-                <w:color w:val="333399"/>
-                <w:sz w:val="18"/>
-                <w:szCs w:val="18"/>
-                <w:lang w:eastAsia="en-US"/>
-              </w:rPr>
-            </w:pPr>
-            <w:r>
-              <w:rPr>
-                <w:rFonts w:ascii="Arial" w:eastAsia="Times New Roman" w:hAnsi="Arial" w:cs="Arial"/>
-                <w:color w:val="333399"/>
-                <w:sz w:val="18"/>
-                <w:szCs w:val="18"/>
-                <w:lang w:eastAsia="en-US"/>
-              </w:rPr>
-              <w:t>Total</w:t>
-            </w:r>
-          </w:p>
-        </w:tc>
-        <w:tc>
-          <w:tcPr>
-            <w:tcW w:w="960" w:type="dxa"/>
-            <w:tcBorders>
-              <w:top w:val="nil"/>
-              <w:left w:val="nil"/>
-              <w:bottom w:val="single" w:sz="4" w:space="0" w:color="auto"/>
-              <w:right w:val="single" w:sz="4" w:space="0" w:color="auto"/>
-            </w:tcBorders>
-            <w:shd w:val="clear" w:color="000000" w:fill="FFFFFF"/>
-            <w:noWrap/>
-            <w:hideMark/>
-          </w:tcPr>
-          <w:p>
-            <w:pPr>
-              <w:jc w:val="right"/>
-              <w:rPr>
-                <w:rFonts w:ascii="Arial" w:eastAsia="Times New Roman" w:hAnsi="Arial" w:cs="Arial"/>
-                <w:color w:val="993300"/>
-                <w:sz w:val="18"/>
-                <w:szCs w:val="18"/>
-                <w:lang w:eastAsia="en-US"/>
-              </w:rPr>
-            </w:pPr>
-            <w:r>
-              <w:rPr>
-                <w:rFonts w:ascii="Arial" w:eastAsia="Times New Roman" w:hAnsi="Arial" w:cs="Arial"/>
-                <w:color w:val="993300"/>
-                <w:sz w:val="18"/>
-                <w:szCs w:val="18"/>
-                <w:lang w:eastAsia="en-US"/>
-              </w:rPr>
-              <w:t>790.244</w:t>
-            </w:r>
-          </w:p>
-        </w:tc>
-        <w:tc>
-          <w:tcPr>
-            <w:tcW w:w="960" w:type="dxa"/>
-            <w:tcBorders>
-              <w:top w:val="nil"/>
-              <w:left w:val="nil"/>
-              <w:bottom w:val="single" w:sz="4" w:space="0" w:color="auto"/>
-              <w:right w:val="single" w:sz="4" w:space="0" w:color="auto"/>
-            </w:tcBorders>
-            <w:shd w:val="clear" w:color="000000" w:fill="FFFFFF"/>
-            <w:noWrap/>
-            <w:hideMark/>
-          </w:tcPr>
-          <w:p>
-            <w:pPr>
-              <w:jc w:val="right"/>
-              <w:rPr>
-                <w:rFonts w:ascii="Arial" w:eastAsia="Times New Roman" w:hAnsi="Arial" w:cs="Arial"/>
-                <w:color w:val="993300"/>
-                <w:sz w:val="18"/>
-                <w:szCs w:val="18"/>
-                <w:lang w:eastAsia="en-US"/>
-              </w:rPr>
-            </w:pPr>
-            <w:r>
-              <w:rPr>
-                <w:rFonts w:ascii="Arial" w:eastAsia="Times New Roman" w:hAnsi="Arial" w:cs="Arial"/>
-                <w:color w:val="993300"/>
-                <w:sz w:val="18"/>
-                <w:szCs w:val="18"/>
-                <w:lang w:eastAsia="en-US"/>
-              </w:rPr>
-              <w:t>1002</w:t>
-            </w:r>
-          </w:p>
-        </w:tc>
-        <w:tc>
-          <w:tcPr>
-            <w:tcW w:w="960" w:type="dxa"/>
-            <w:tcBorders>
-              <w:top w:val="nil"/>
-              <w:left w:val="nil"/>
-              <w:bottom w:val="single" w:sz="4" w:space="0" w:color="auto"/>
-              <w:right w:val="single" w:sz="4" w:space="0" w:color="auto"/>
-            </w:tcBorders>
-            <w:shd w:val="clear" w:color="000000" w:fill="FFFFFF"/>
-            <w:hideMark/>
-          </w:tcPr>
-          <w:p>
-            <w:pPr>
-              <w:rPr>
-                <w:rFonts w:ascii="Arial" w:eastAsia="Times New Roman" w:hAnsi="Arial" w:cs="Arial"/>
-                <w:color w:val="993300"/>
-                <w:sz w:val="18"/>
-                <w:szCs w:val="18"/>
-                <w:lang w:eastAsia="en-US"/>
-              </w:rPr>
-            </w:pPr>
-            <w:r>
-              <w:rPr>
-                <w:rFonts w:ascii="Arial" w:eastAsia="Times New Roman" w:hAnsi="Arial" w:cs="Arial"/>
-                <w:color w:val="993300"/>
-                <w:sz w:val="18"/>
-                <w:szCs w:val="18"/>
-                <w:lang w:eastAsia="en-US"/>
-              </w:rPr>
-              <w:t> </w:t>
-            </w:r>
-          </w:p>
-        </w:tc>
-        <w:tc>
-          <w:tcPr>
-            <w:tcW w:w="960" w:type="dxa"/>
-            <w:tcBorders>
-              <w:top w:val="nil"/>
-              <w:left w:val="nil"/>
-              <w:bottom w:val="single" w:sz="4" w:space="0" w:color="auto"/>
-              <w:right w:val="single" w:sz="4" w:space="0" w:color="auto"/>
-            </w:tcBorders>
-            <w:shd w:val="clear" w:color="000000" w:fill="FFFFFF"/>
-            <w:hideMark/>
-          </w:tcPr>
-          <w:p>
-            <w:pPr>
-              <w:rPr>
-                <w:rFonts w:ascii="Arial" w:eastAsia="Times New Roman" w:hAnsi="Arial" w:cs="Arial"/>
-                <w:color w:val="993300"/>
-                <w:sz w:val="18"/>
-                <w:szCs w:val="18"/>
-                <w:lang w:eastAsia="en-US"/>
-              </w:rPr>
-            </w:pPr>
-            <w:r>
-              <w:rPr>
-                <w:rFonts w:ascii="Arial" w:eastAsia="Times New Roman" w:hAnsi="Arial" w:cs="Arial"/>
-                <w:color w:val="993300"/>
-                <w:sz w:val="18"/>
-                <w:szCs w:val="18"/>
-                <w:lang w:eastAsia="en-US"/>
-              </w:rPr>
-              <w:t> </w:t>
-            </w:r>
-          </w:p>
-        </w:tc>
-        <w:tc>
-          <w:tcPr>
-            <w:tcW w:w="960" w:type="dxa"/>
-            <w:tcBorders>
-              <w:top w:val="nil"/>
-              <w:left w:val="nil"/>
-              <w:bottom w:val="single" w:sz="4" w:space="0" w:color="auto"/>
-              <w:right w:val="single" w:sz="4" w:space="0" w:color="auto"/>
-            </w:tcBorders>
-            <w:shd w:val="clear" w:color="000000" w:fill="FFFFFF"/>
-            <w:hideMark/>
-          </w:tcPr>
-          <w:p>
-            <w:pPr>
-              <w:rPr>
-                <w:rFonts w:ascii="Arial" w:eastAsia="Times New Roman" w:hAnsi="Arial" w:cs="Arial"/>
-                <w:color w:val="993300"/>
-                <w:sz w:val="18"/>
-                <w:szCs w:val="18"/>
-                <w:lang w:eastAsia="en-US"/>
-              </w:rPr>
-            </w:pPr>
-            <w:r>
-              <w:rPr>
-                <w:rFonts w:ascii="Arial" w:eastAsia="Times New Roman" w:hAnsi="Arial" w:cs="Arial"/>
-                <w:color w:val="993300"/>
-                <w:sz w:val="18"/>
-                <w:szCs w:val="18"/>
-                <w:lang w:eastAsia="en-US"/>
-              </w:rPr>
-              <w:t> </w:t>
-            </w:r>
-          </w:p>
-        </w:tc>
-      </w:tr>
-      <w:tr>
-        <w:trPr>
-          <w:trHeight w:val="288"/>
-          <w:jc w:val="center"/>
-        </w:trPr>
-        <w:tc>
-          <w:tcPr>
-            <w:tcW w:w="5760" w:type="dxa"/>
-            <w:gridSpan w:val="6"/>
-            <w:tcBorders>
-              <w:top w:val="single" w:sz="4" w:space="0" w:color="auto"/>
-              <w:left w:val="single" w:sz="4" w:space="0" w:color="auto"/>
-              <w:bottom w:val="single" w:sz="4" w:space="0" w:color="auto"/>
-              <w:right w:val="single" w:sz="4" w:space="0" w:color="auto"/>
-            </w:tcBorders>
-            <w:shd w:val="clear" w:color="000000" w:fill="FFFFFF"/>
-            <w:noWrap/>
-            <w:vAlign w:val="bottom"/>
-            <w:hideMark/>
-          </w:tcPr>
-          <w:p>
-            <w:pPr>
-              <w:jc w:val="center"/>
-              <w:rPr>
-                <w:rFonts w:ascii="Arial" w:eastAsia="Times New Roman" w:hAnsi="Arial" w:cs="Arial"/>
-                <w:b/>
-                <w:bCs/>
-                <w:color w:val="993300"/>
-                <w:sz w:val="18"/>
-                <w:szCs w:val="18"/>
-                <w:lang w:eastAsia="en-US"/>
-              </w:rPr>
-            </w:pPr>
-            <w:proofErr w:type="spellStart"/>
-            <w:r>
-              <w:rPr>
-                <w:rFonts w:ascii="Arial" w:eastAsia="Times New Roman" w:hAnsi="Arial" w:cs="Arial"/>
-                <w:b/>
-                <w:bCs/>
-                <w:color w:val="993300"/>
-                <w:sz w:val="18"/>
-                <w:szCs w:val="18"/>
-                <w:lang w:eastAsia="en-US"/>
-              </w:rPr>
-              <w:t>experience_index</w:t>
-            </w:r>
-            <w:proofErr w:type="spellEnd"/>
-            <w:r>
-              <w:rPr>
-                <w:rFonts w:ascii="Arial" w:eastAsia="Times New Roman" w:hAnsi="Arial" w:cs="Arial"/>
-                <w:b/>
-                <w:bCs/>
-                <w:color w:val="993300"/>
-                <w:sz w:val="18"/>
-                <w:szCs w:val="18"/>
-                <w:lang w:eastAsia="en-US"/>
-              </w:rPr>
-              <w:t xml:space="preserve"> &amp; level of education</w:t>
-            </w:r>
-          </w:p>
-        </w:tc>
-      </w:tr>
-      <w:tr>
-        <w:trPr>
-          <w:trHeight w:val="480"/>
-          <w:jc w:val="center"/>
-        </w:trPr>
-        <w:tc>
-          <w:tcPr>
-            <w:tcW w:w="960" w:type="dxa"/>
-            <w:tcBorders>
-              <w:top w:val="nil"/>
-              <w:left w:val="single" w:sz="4" w:space="0" w:color="auto"/>
-              <w:bottom w:val="single" w:sz="4" w:space="0" w:color="auto"/>
-              <w:right w:val="single" w:sz="4" w:space="0" w:color="auto"/>
-            </w:tcBorders>
-            <w:shd w:val="clear" w:color="auto" w:fill="auto"/>
-            <w:vAlign w:val="bottom"/>
-            <w:hideMark/>
-          </w:tcPr>
-          <w:p>
-            <w:pPr>
-              <w:rPr>
-                <w:rFonts w:ascii="Arial" w:eastAsia="Times New Roman" w:hAnsi="Arial" w:cs="Arial"/>
-                <w:color w:val="333399"/>
-                <w:sz w:val="18"/>
-                <w:szCs w:val="18"/>
-                <w:lang w:eastAsia="en-US"/>
-              </w:rPr>
-            </w:pPr>
-            <w:r>
-              <w:rPr>
-                <w:rFonts w:ascii="Arial" w:eastAsia="Times New Roman" w:hAnsi="Arial" w:cs="Arial"/>
-                <w:color w:val="333399"/>
-                <w:sz w:val="18"/>
-                <w:szCs w:val="18"/>
-                <w:lang w:eastAsia="en-US"/>
-              </w:rPr>
-              <w:t> </w:t>
-            </w:r>
-          </w:p>
-        </w:tc>
-        <w:tc>
-          <w:tcPr>
-            <w:tcW w:w="960" w:type="dxa"/>
-            <w:tcBorders>
-              <w:top w:val="nil"/>
-              <w:left w:val="nil"/>
-              <w:bottom w:val="single" w:sz="4" w:space="0" w:color="auto"/>
-              <w:right w:val="single" w:sz="4" w:space="0" w:color="auto"/>
-            </w:tcBorders>
-            <w:shd w:val="clear" w:color="auto" w:fill="auto"/>
-            <w:vAlign w:val="bottom"/>
-            <w:hideMark/>
-          </w:tcPr>
-          <w:p>
-            <w:pPr>
-              <w:jc w:val="center"/>
-              <w:rPr>
-                <w:rFonts w:ascii="Arial" w:eastAsia="Times New Roman" w:hAnsi="Arial" w:cs="Arial"/>
-                <w:color w:val="333399"/>
-                <w:sz w:val="18"/>
-                <w:szCs w:val="18"/>
-                <w:lang w:eastAsia="en-US"/>
-              </w:rPr>
-            </w:pPr>
-            <w:r>
-              <w:rPr>
-                <w:rFonts w:ascii="Arial" w:eastAsia="Times New Roman" w:hAnsi="Arial" w:cs="Arial"/>
-                <w:color w:val="333399"/>
-                <w:sz w:val="18"/>
-                <w:szCs w:val="18"/>
-                <w:lang w:eastAsia="en-US"/>
-              </w:rPr>
-              <w:t>Sum of Squares</w:t>
-            </w:r>
-          </w:p>
-        </w:tc>
-        <w:tc>
-          <w:tcPr>
-            <w:tcW w:w="960" w:type="dxa"/>
-            <w:tcBorders>
-              <w:top w:val="nil"/>
-              <w:left w:val="nil"/>
-              <w:bottom w:val="single" w:sz="4" w:space="0" w:color="auto"/>
-              <w:right w:val="single" w:sz="4" w:space="0" w:color="auto"/>
-            </w:tcBorders>
-            <w:shd w:val="clear" w:color="auto" w:fill="auto"/>
-            <w:vAlign w:val="bottom"/>
-            <w:hideMark/>
-          </w:tcPr>
-          <w:p>
-            <w:pPr>
-              <w:jc w:val="center"/>
-              <w:rPr>
-                <w:rFonts w:ascii="Arial" w:eastAsia="Times New Roman" w:hAnsi="Arial" w:cs="Arial"/>
-                <w:color w:val="333399"/>
-                <w:sz w:val="18"/>
-                <w:szCs w:val="18"/>
-                <w:lang w:eastAsia="en-US"/>
-              </w:rPr>
-            </w:pPr>
-            <w:proofErr w:type="spellStart"/>
-            <w:r>
-              <w:rPr>
-                <w:rFonts w:ascii="Arial" w:eastAsia="Times New Roman" w:hAnsi="Arial" w:cs="Arial"/>
-                <w:color w:val="333399"/>
-                <w:sz w:val="18"/>
-                <w:szCs w:val="18"/>
-                <w:lang w:eastAsia="en-US"/>
-              </w:rPr>
-              <w:t>df</w:t>
-            </w:r>
-            <w:proofErr w:type="spellEnd"/>
           </w:p>
         </w:tc>
         <w:tc>
@@ -6128,6 +5903,7 @@
         <w:ind w:firstLine="720"/>
       </w:pPr>
       <w:r>
+        <w:lastRenderedPageBreak/>
         <w:t>Addressing the discovery in the previous paragraph</w:t>
       </w:r>
       <w:r>
@@ -6148,13 +5924,8 @@
       <w:r>
         <w:t xml:space="preserve"> </w:t>
       </w:r>
-      <w:proofErr w:type="gramStart"/>
       <w:r>
-        <w:t>Post-hoc</w:t>
-      </w:r>
-      <w:proofErr w:type="gramEnd"/>
-      <w:r>
-        <w:t xml:space="preserve"> comparisons (Bonferroni-adjusted)</w:t>
+        <w:t>Post-hoc comparisons (Bonferroni-adjusted)</w:t>
       </w:r>
       <w:r>
         <w:t xml:space="preserve"> were performed and they</w:t>
@@ -6168,6 +5939,9 @@
         <w:spacing w:line="360" w:lineRule="auto"/>
       </w:pPr>
       <w:r>
+        <w:rPr>
+          <w:noProof/>
+        </w:rPr>
         <w:drawing>
           <wp:inline distT="0" distB="0" distL="0" distR="0" wp14:anchorId="427A15A0" wp14:editId="24DB186B">
             <wp:extent cx="5943600" cy="2270760"/>
@@ -6244,12 +6018,6 @@
         <w:gridCol w:w="1469"/>
       </w:tblGrid>
       <w:tr>
-        <w:tblPrEx>
-          <w:tblCellMar>
-            <w:top w:w="0" w:type="dxa"/>
-            <w:bottom w:w="0" w:type="dxa"/>
-          </w:tblCellMar>
-        </w:tblPrEx>
         <w:trPr>
           <w:cantSplit/>
         </w:trPr>
@@ -6281,12 +6049,6 @@
         </w:tc>
       </w:tr>
       <w:tr>
-        <w:tblPrEx>
-          <w:tblCellMar>
-            <w:top w:w="0" w:type="dxa"/>
-            <w:bottom w:w="0" w:type="dxa"/>
-          </w:tblCellMar>
-        </w:tblPrEx>
         <w:trPr>
           <w:cantSplit/>
         </w:trPr>
@@ -6397,12 +6159,6 @@
         </w:tc>
       </w:tr>
       <w:tr>
-        <w:tblPrEx>
-          <w:tblCellMar>
-            <w:top w:w="0" w:type="dxa"/>
-            <w:bottom w:w="0" w:type="dxa"/>
-          </w:tblCellMar>
-        </w:tblPrEx>
         <w:trPr>
           <w:cantSplit/>
         </w:trPr>
@@ -6514,12 +6270,6 @@
         </w:tc>
       </w:tr>
       <w:tr>
-        <w:tblPrEx>
-          <w:tblCellMar>
-            <w:top w:w="0" w:type="dxa"/>
-            <w:bottom w:w="0" w:type="dxa"/>
-          </w:tblCellMar>
-        </w:tblPrEx>
         <w:trPr>
           <w:cantSplit/>
         </w:trPr>
@@ -6537,53 +6287,8 @@
           </w:tcPr>
           <w:p>
             <w:r>
-              <w:t xml:space="preserve">a. Predictors: (Constant), Your highest level of completed </w:t>
-            </w:r>
-            <w:proofErr w:type="gramStart"/>
-            <w:r>
-              <w:t>education?,</w:t>
-            </w:r>
-            <w:proofErr w:type="gramEnd"/>
-            <w:r>
-              <w:t xml:space="preserve"> </w:t>
-            </w:r>
-            <w:proofErr w:type="spellStart"/>
-            <w:r>
-              <w:t>experience_index</w:t>
-            </w:r>
-            <w:proofErr w:type="spellEnd"/>
-            <w:r>
-              <w:t xml:space="preserve">, </w:t>
-            </w:r>
-            <w:proofErr w:type="spellStart"/>
-            <w:r>
-              <w:t>urban_rural</w:t>
-            </w:r>
-            <w:proofErr w:type="spellEnd"/>
-            <w:r>
-              <w:t xml:space="preserve">, Sex, </w:t>
-            </w:r>
-            <w:proofErr w:type="spellStart"/>
-            <w:r>
-              <w:t>distrust_highed</w:t>
-            </w:r>
-            <w:proofErr w:type="spellEnd"/>
-            <w:r>
-              <w:t xml:space="preserve">, How old are you?, </w:t>
-            </w:r>
-            <w:proofErr w:type="spellStart"/>
-            <w:r>
-              <w:t>tolerance_index</w:t>
-            </w:r>
-            <w:proofErr w:type="spellEnd"/>
-            <w:r>
-              <w:t xml:space="preserve">, </w:t>
-            </w:r>
-            <w:proofErr w:type="spellStart"/>
-            <w:r>
-              <w:t>urban_town</w:t>
-            </w:r>
-            <w:proofErr w:type="spellEnd"/>
+              <w:t>a. Predictors: (Constant), Your highest level of completed education?, experience_index, urban_rural, Sex, distrust_highed, How old are you?, tolerance_index, urban_town</w:t>
+            </w:r>
           </w:p>
         </w:tc>
       </w:tr>
@@ -6613,12 +6318,6 @@
         <w:gridCol w:w="1025"/>
       </w:tblGrid>
       <w:tr>
-        <w:tblPrEx>
-          <w:tblCellMar>
-            <w:top w:w="0" w:type="dxa"/>
-            <w:bottom w:w="0" w:type="dxa"/>
-          </w:tblCellMar>
-        </w:tblPrEx>
         <w:trPr>
           <w:cantSplit/>
         </w:trPr>
@@ -6639,7 +6338,6 @@
             <w:pPr>
               <w:spacing w:line="360" w:lineRule="auto"/>
             </w:pPr>
-            <w:proofErr w:type="spellStart"/>
             <w:r>
               <w:rPr>
                 <w:b/>
@@ -6655,17 +6353,10 @@
               </w:rPr>
               <w:t>a</w:t>
             </w:r>
-            <w:proofErr w:type="spellEnd"/>
           </w:p>
         </w:tc>
       </w:tr>
       <w:tr>
-        <w:tblPrEx>
-          <w:tblCellMar>
-            <w:top w:w="0" w:type="dxa"/>
-            <w:bottom w:w="0" w:type="dxa"/>
-          </w:tblCellMar>
-        </w:tblPrEx>
         <w:trPr>
           <w:cantSplit/>
         </w:trPr>
@@ -6728,11 +6419,9 @@
             <w:pPr>
               <w:spacing w:line="360" w:lineRule="auto"/>
             </w:pPr>
-            <w:proofErr w:type="spellStart"/>
             <w:r>
               <w:t>df</w:t>
             </w:r>
-            <w:proofErr w:type="spellEnd"/>
           </w:p>
         </w:tc>
         <w:tc>
@@ -6800,12 +6489,6 @@
         </w:tc>
       </w:tr>
       <w:tr>
-        <w:tblPrEx>
-          <w:tblCellMar>
-            <w:top w:w="0" w:type="dxa"/>
-            <w:bottom w:w="0" w:type="dxa"/>
-          </w:tblCellMar>
-        </w:tblPrEx>
         <w:trPr>
           <w:cantSplit/>
         </w:trPr>
@@ -6958,12 +6641,6 @@
         </w:tc>
       </w:tr>
       <w:tr>
-        <w:tblPrEx>
-          <w:tblCellMar>
-            <w:top w:w="0" w:type="dxa"/>
-            <w:bottom w:w="0" w:type="dxa"/>
-          </w:tblCellMar>
-        </w:tblPrEx>
         <w:trPr>
           <w:cantSplit/>
         </w:trPr>
@@ -7103,12 +6780,6 @@
         </w:tc>
       </w:tr>
       <w:tr>
-        <w:tblPrEx>
-          <w:tblCellMar>
-            <w:top w:w="0" w:type="dxa"/>
-            <w:bottom w:w="0" w:type="dxa"/>
-          </w:tblCellMar>
-        </w:tblPrEx>
         <w:trPr>
           <w:cantSplit/>
         </w:trPr>
@@ -7246,12 +6917,6 @@
         </w:tc>
       </w:tr>
       <w:tr>
-        <w:tblPrEx>
-          <w:tblCellMar>
-            <w:top w:w="0" w:type="dxa"/>
-            <w:bottom w:w="0" w:type="dxa"/>
-          </w:tblCellMar>
-        </w:tblPrEx>
         <w:trPr>
           <w:cantSplit/>
         </w:trPr>
@@ -7272,23 +6937,12 @@
               <w:spacing w:line="360" w:lineRule="auto"/>
             </w:pPr>
             <w:r>
-              <w:t xml:space="preserve">a. Dependent Variable: </w:t>
-            </w:r>
-            <w:proofErr w:type="spellStart"/>
-            <w:r>
-              <w:t>corr_highed</w:t>
-            </w:r>
-            <w:proofErr w:type="spellEnd"/>
+              <w:t>a. Dependent Variable: corr_highed</w:t>
+            </w:r>
           </w:p>
         </w:tc>
       </w:tr>
       <w:tr>
-        <w:tblPrEx>
-          <w:tblCellMar>
-            <w:top w:w="0" w:type="dxa"/>
-            <w:bottom w:w="0" w:type="dxa"/>
-          </w:tblCellMar>
-        </w:tblPrEx>
         <w:trPr>
           <w:cantSplit/>
         </w:trPr>
@@ -7309,53 +6963,8 @@
               <w:spacing w:line="360" w:lineRule="auto"/>
             </w:pPr>
             <w:r>
-              <w:t xml:space="preserve">b. Predictors: (Constant), Your highest level of completed </w:t>
-            </w:r>
-            <w:proofErr w:type="gramStart"/>
-            <w:r>
-              <w:t>education?,</w:t>
-            </w:r>
-            <w:proofErr w:type="gramEnd"/>
-            <w:r>
-              <w:t xml:space="preserve"> </w:t>
-            </w:r>
-            <w:proofErr w:type="spellStart"/>
-            <w:r>
-              <w:t>experience_index</w:t>
-            </w:r>
-            <w:proofErr w:type="spellEnd"/>
-            <w:r>
-              <w:t xml:space="preserve">, </w:t>
-            </w:r>
-            <w:proofErr w:type="spellStart"/>
-            <w:r>
-              <w:t>urban_rural</w:t>
-            </w:r>
-            <w:proofErr w:type="spellEnd"/>
-            <w:r>
-              <w:t xml:space="preserve">, Sex, </w:t>
-            </w:r>
-            <w:proofErr w:type="spellStart"/>
-            <w:r>
-              <w:t>distrust_highed</w:t>
-            </w:r>
-            <w:proofErr w:type="spellEnd"/>
-            <w:r>
-              <w:t xml:space="preserve">, How old are you?, </w:t>
-            </w:r>
-            <w:proofErr w:type="spellStart"/>
-            <w:r>
-              <w:t>tolerance_index</w:t>
-            </w:r>
-            <w:proofErr w:type="spellEnd"/>
-            <w:r>
-              <w:t xml:space="preserve">, </w:t>
-            </w:r>
-            <w:proofErr w:type="spellStart"/>
-            <w:r>
-              <w:t>urban_town</w:t>
-            </w:r>
-            <w:proofErr w:type="spellEnd"/>
+              <w:t>b. Predictors: (Constant), Your highest level of completed education?, experience_index, urban_rural, Sex, distrust_highed, How old are you?, tolerance_index, urban_town</w:t>
+            </w:r>
           </w:p>
         </w:tc>
       </w:tr>
@@ -7390,12 +6999,6 @@
         <w:gridCol w:w="1025"/>
       </w:tblGrid>
       <w:tr>
-        <w:tblPrEx>
-          <w:tblCellMar>
-            <w:top w:w="0" w:type="dxa"/>
-            <w:bottom w:w="0" w:type="dxa"/>
-          </w:tblCellMar>
-        </w:tblPrEx>
         <w:trPr>
           <w:cantSplit/>
         </w:trPr>
@@ -7416,7 +7019,6 @@
             <w:pPr>
               <w:spacing w:line="360" w:lineRule="auto"/>
             </w:pPr>
-            <w:proofErr w:type="spellStart"/>
             <w:r>
               <w:rPr>
                 <w:b/>
@@ -7432,17 +7034,10 @@
               </w:rPr>
               <w:t>a</w:t>
             </w:r>
-            <w:proofErr w:type="spellEnd"/>
           </w:p>
         </w:tc>
       </w:tr>
       <w:tr>
-        <w:tblPrEx>
-          <w:tblCellMar>
-            <w:top w:w="0" w:type="dxa"/>
-            <w:bottom w:w="0" w:type="dxa"/>
-          </w:tblCellMar>
-        </w:tblPrEx>
         <w:trPr>
           <w:cantSplit/>
         </w:trPr>
@@ -7558,12 +7153,6 @@
         </w:tc>
       </w:tr>
       <w:tr>
-        <w:tblPrEx>
-          <w:tblCellMar>
-            <w:top w:w="0" w:type="dxa"/>
-            <w:bottom w:w="0" w:type="dxa"/>
-          </w:tblCellMar>
-        </w:tblPrEx>
         <w:trPr>
           <w:cantSplit/>
         </w:trPr>
@@ -7690,12 +7279,6 @@
         </w:tc>
       </w:tr>
       <w:tr>
-        <w:tblPrEx>
-          <w:tblCellMar>
-            <w:top w:w="0" w:type="dxa"/>
-            <w:bottom w:w="0" w:type="dxa"/>
-          </w:tblCellMar>
-        </w:tblPrEx>
         <w:trPr>
           <w:cantSplit/>
         </w:trPr>
@@ -7840,12 +7423,6 @@
         </w:tc>
       </w:tr>
       <w:tr>
-        <w:tblPrEx>
-          <w:tblCellMar>
-            <w:top w:w="0" w:type="dxa"/>
-            <w:bottom w:w="0" w:type="dxa"/>
-          </w:tblCellMar>
-        </w:tblPrEx>
         <w:trPr>
           <w:cantSplit/>
         </w:trPr>
@@ -7882,11 +7459,9 @@
             <w:pPr>
               <w:spacing w:line="360" w:lineRule="auto"/>
             </w:pPr>
-            <w:proofErr w:type="spellStart"/>
             <w:r>
               <w:t>tolerance_index</w:t>
             </w:r>
-            <w:proofErr w:type="spellEnd"/>
           </w:p>
         </w:tc>
         <w:tc>
@@ -7991,12 +7566,6 @@
         </w:tc>
       </w:tr>
       <w:tr>
-        <w:tblPrEx>
-          <w:tblCellMar>
-            <w:top w:w="0" w:type="dxa"/>
-            <w:bottom w:w="0" w:type="dxa"/>
-          </w:tblCellMar>
-        </w:tblPrEx>
         <w:trPr>
           <w:cantSplit/>
         </w:trPr>
@@ -8033,11 +7602,9 @@
             <w:pPr>
               <w:spacing w:line="360" w:lineRule="auto"/>
             </w:pPr>
-            <w:proofErr w:type="spellStart"/>
             <w:r>
               <w:t>experience_index</w:t>
             </w:r>
-            <w:proofErr w:type="spellEnd"/>
           </w:p>
         </w:tc>
         <w:tc>
@@ -8142,12 +7709,6 @@
         </w:tc>
       </w:tr>
       <w:tr>
-        <w:tblPrEx>
-          <w:tblCellMar>
-            <w:top w:w="0" w:type="dxa"/>
-            <w:bottom w:w="0" w:type="dxa"/>
-          </w:tblCellMar>
-        </w:tblPrEx>
         <w:trPr>
           <w:cantSplit/>
         </w:trPr>
@@ -8184,11 +7745,9 @@
             <w:pPr>
               <w:spacing w:line="360" w:lineRule="auto"/>
             </w:pPr>
-            <w:proofErr w:type="spellStart"/>
             <w:r>
               <w:t>distrust_highed</w:t>
             </w:r>
-            <w:proofErr w:type="spellEnd"/>
           </w:p>
         </w:tc>
         <w:tc>
@@ -8293,12 +7852,6 @@
         </w:tc>
       </w:tr>
       <w:tr>
-        <w:tblPrEx>
-          <w:tblCellMar>
-            <w:top w:w="0" w:type="dxa"/>
-            <w:bottom w:w="0" w:type="dxa"/>
-          </w:tblCellMar>
-        </w:tblPrEx>
         <w:trPr>
           <w:cantSplit/>
         </w:trPr>
@@ -8335,11 +7888,9 @@
             <w:pPr>
               <w:spacing w:line="360" w:lineRule="auto"/>
             </w:pPr>
-            <w:proofErr w:type="spellStart"/>
             <w:r>
               <w:t>urban_town</w:t>
             </w:r>
-            <w:proofErr w:type="spellEnd"/>
           </w:p>
         </w:tc>
         <w:tc>
@@ -8444,12 +7995,6 @@
         </w:tc>
       </w:tr>
       <w:tr>
-        <w:tblPrEx>
-          <w:tblCellMar>
-            <w:top w:w="0" w:type="dxa"/>
-            <w:bottom w:w="0" w:type="dxa"/>
-          </w:tblCellMar>
-        </w:tblPrEx>
         <w:trPr>
           <w:cantSplit/>
         </w:trPr>
@@ -8486,11 +8031,9 @@
             <w:pPr>
               <w:spacing w:line="360" w:lineRule="auto"/>
             </w:pPr>
-            <w:proofErr w:type="spellStart"/>
             <w:r>
               <w:t>urban_rural</w:t>
             </w:r>
-            <w:proofErr w:type="spellEnd"/>
           </w:p>
         </w:tc>
         <w:tc>
@@ -8595,12 +8138,6 @@
         </w:tc>
       </w:tr>
       <w:tr>
-        <w:tblPrEx>
-          <w:tblCellMar>
-            <w:top w:w="0" w:type="dxa"/>
-            <w:bottom w:w="0" w:type="dxa"/>
-          </w:tblCellMar>
-        </w:tblPrEx>
         <w:trPr>
           <w:cantSplit/>
         </w:trPr>
@@ -8744,12 +8281,6 @@
         </w:tc>
       </w:tr>
       <w:tr>
-        <w:tblPrEx>
-          <w:tblCellMar>
-            <w:top w:w="0" w:type="dxa"/>
-            <w:bottom w:w="0" w:type="dxa"/>
-          </w:tblCellMar>
-        </w:tblPrEx>
         <w:trPr>
           <w:cantSplit/>
         </w:trPr>
@@ -8893,12 +8424,6 @@
         </w:tc>
       </w:tr>
       <w:tr>
-        <w:tblPrEx>
-          <w:tblCellMar>
-            <w:top w:w="0" w:type="dxa"/>
-            <w:bottom w:w="0" w:type="dxa"/>
-          </w:tblCellMar>
-        </w:tblPrEx>
         <w:trPr>
           <w:cantSplit/>
         </w:trPr>
@@ -9042,12 +8567,6 @@
         </w:tc>
       </w:tr>
       <w:tr>
-        <w:tblPrEx>
-          <w:tblCellMar>
-            <w:top w:w="0" w:type="dxa"/>
-            <w:bottom w:w="0" w:type="dxa"/>
-          </w:tblCellMar>
-        </w:tblPrEx>
         <w:trPr>
           <w:cantSplit/>
         </w:trPr>
@@ -9068,13 +8587,8 @@
               <w:spacing w:line="360" w:lineRule="auto"/>
             </w:pPr>
             <w:r>
-              <w:t xml:space="preserve">a. Dependent Variable: </w:t>
-            </w:r>
-            <w:proofErr w:type="spellStart"/>
-            <w:r>
-              <w:t>corr_highed</w:t>
-            </w:r>
-            <w:proofErr w:type="spellEnd"/>
+              <w:t>a. Dependent Variable: corr_highed</w:t>
+            </w:r>
           </w:p>
         </w:tc>
       </w:tr>
@@ -9090,13 +8604,8 @@
         <w:ind w:firstLine="720"/>
       </w:pPr>
       <w:r>
-        <w:t xml:space="preserve">The inclusion of systemic governance factors further strengthens the model (R² = 0.406, p &lt; 0.001), with the state capture index emerging as a significant predictor of perceived corruption in higher education (β = 0.208, p &lt; 0.001). This finding suggests that corruption in higher education is not an isolated phenomenon, but rather reflects broader patterns of institutional distortion and governance failure. The effects of distrust, tolerance, and experience remain stable in magnitude and significance, indicating that both individual-level and system-level factors independently contribute to corruption perceptions. Geographic differences also persist, with respondents in towns and rural areas continuing to report higher perceived corruption compared to those in </w:t>
+        <w:t>The inclusion of systemic governance factors further strengthens the model (R² = 0.406, p &lt; 0.001), with the state capture index emerging as a significant predictor of perceived corruption in higher education (β = 0.208, p &lt; 0.001). This finding suggests that corruption in higher education is not an isolated phenomenon, but rather reflects broader patterns of institutional distortion and governance failure. The effects of distrust, tolerance, and experience remain stable in magnitude and significance, indicating that both individual-level and system-level factors independently contribute to corruption perceptions. Geographic differences also persist, with respondents in towns and rural areas continuing to report higher perceived corruption compared to those in cities .</w:t>
       </w:r>
-      <w:proofErr w:type="gramStart"/>
-      <w:r>
-        <w:t>cities .</w:t>
-      </w:r>
-      <w:proofErr w:type="gramEnd"/>
     </w:p>
     <w:p>
       <w:pPr>
@@ -9121,12 +8630,6 @@
         <w:gridCol w:w="1469"/>
       </w:tblGrid>
       <w:tr>
-        <w:tblPrEx>
-          <w:tblCellMar>
-            <w:top w:w="0" w:type="dxa"/>
-            <w:bottom w:w="0" w:type="dxa"/>
-          </w:tblCellMar>
-        </w:tblPrEx>
         <w:trPr>
           <w:cantSplit/>
         </w:trPr>
@@ -9158,12 +8661,6 @@
         </w:tc>
       </w:tr>
       <w:tr>
-        <w:tblPrEx>
-          <w:tblCellMar>
-            <w:top w:w="0" w:type="dxa"/>
-            <w:bottom w:w="0" w:type="dxa"/>
-          </w:tblCellMar>
-        </w:tblPrEx>
         <w:trPr>
           <w:cantSplit/>
         </w:trPr>
@@ -9274,12 +8771,6 @@
         </w:tc>
       </w:tr>
       <w:tr>
-        <w:tblPrEx>
-          <w:tblCellMar>
-            <w:top w:w="0" w:type="dxa"/>
-            <w:bottom w:w="0" w:type="dxa"/>
-          </w:tblCellMar>
-        </w:tblPrEx>
         <w:trPr>
           <w:cantSplit/>
         </w:trPr>
@@ -9391,12 +8882,6 @@
         </w:tc>
       </w:tr>
       <w:tr>
-        <w:tblPrEx>
-          <w:tblCellMar>
-            <w:top w:w="0" w:type="dxa"/>
-            <w:bottom w:w="0" w:type="dxa"/>
-          </w:tblCellMar>
-        </w:tblPrEx>
         <w:trPr>
           <w:cantSplit/>
         </w:trPr>
@@ -9417,61 +8902,8 @@
               <w:spacing w:line="360" w:lineRule="auto"/>
             </w:pPr>
             <w:r>
-              <w:t xml:space="preserve">a. Predictors: (Constant), Your highest level of completed </w:t>
-            </w:r>
-            <w:proofErr w:type="gramStart"/>
-            <w:r>
-              <w:t>education?,</w:t>
-            </w:r>
-            <w:proofErr w:type="gramEnd"/>
-            <w:r>
-              <w:t xml:space="preserve"> </w:t>
-            </w:r>
-            <w:proofErr w:type="spellStart"/>
-            <w:r>
-              <w:t>experience_index</w:t>
-            </w:r>
-            <w:proofErr w:type="spellEnd"/>
-            <w:r>
-              <w:t xml:space="preserve">, </w:t>
-            </w:r>
-            <w:proofErr w:type="spellStart"/>
-            <w:r>
-              <w:t>urban_rural</w:t>
-            </w:r>
-            <w:proofErr w:type="spellEnd"/>
-            <w:r>
-              <w:t xml:space="preserve">, Sex, </w:t>
-            </w:r>
-            <w:proofErr w:type="spellStart"/>
-            <w:r>
-              <w:t>state_capture</w:t>
-            </w:r>
-            <w:proofErr w:type="spellEnd"/>
-            <w:r>
-              <w:t xml:space="preserve">, How old are you?, </w:t>
-            </w:r>
-            <w:proofErr w:type="spellStart"/>
-            <w:r>
-              <w:t>distrust_highed</w:t>
-            </w:r>
-            <w:proofErr w:type="spellEnd"/>
-            <w:r>
-              <w:t xml:space="preserve">, </w:t>
-            </w:r>
-            <w:proofErr w:type="spellStart"/>
-            <w:r>
-              <w:t>tolerance_index</w:t>
-            </w:r>
-            <w:proofErr w:type="spellEnd"/>
-            <w:r>
-              <w:t xml:space="preserve">, </w:t>
-            </w:r>
-            <w:proofErr w:type="spellStart"/>
-            <w:r>
-              <w:t>urban_town</w:t>
-            </w:r>
-            <w:proofErr w:type="spellEnd"/>
+              <w:t>a. Predictors: (Constant), Your highest level of completed education?, experience_index, urban_rural, Sex, state_capture, How old are you?, distrust_highed, tolerance_index, urban_town</w:t>
+            </w:r>
           </w:p>
         </w:tc>
       </w:tr>
@@ -9506,12 +8938,6 @@
         <w:gridCol w:w="1025"/>
       </w:tblGrid>
       <w:tr>
-        <w:tblPrEx>
-          <w:tblCellMar>
-            <w:top w:w="0" w:type="dxa"/>
-            <w:bottom w:w="0" w:type="dxa"/>
-          </w:tblCellMar>
-        </w:tblPrEx>
         <w:trPr>
           <w:cantSplit/>
         </w:trPr>
@@ -9532,7 +8958,6 @@
             <w:pPr>
               <w:spacing w:line="360" w:lineRule="auto"/>
             </w:pPr>
-            <w:proofErr w:type="spellStart"/>
             <w:r>
               <w:rPr>
                 <w:b/>
@@ -9548,17 +8973,10 @@
               </w:rPr>
               <w:t>a</w:t>
             </w:r>
-            <w:proofErr w:type="spellEnd"/>
           </w:p>
         </w:tc>
       </w:tr>
       <w:tr>
-        <w:tblPrEx>
-          <w:tblCellMar>
-            <w:top w:w="0" w:type="dxa"/>
-            <w:bottom w:w="0" w:type="dxa"/>
-          </w:tblCellMar>
-        </w:tblPrEx>
         <w:trPr>
           <w:cantSplit/>
         </w:trPr>
@@ -9580,6 +8998,7 @@
               <w:spacing w:line="360" w:lineRule="auto"/>
             </w:pPr>
             <w:r>
+              <w:lastRenderedPageBreak/>
               <w:t>Model</w:t>
             </w:r>
           </w:p>
@@ -9621,11 +9040,9 @@
             <w:pPr>
               <w:spacing w:line="360" w:lineRule="auto"/>
             </w:pPr>
-            <w:proofErr w:type="spellStart"/>
             <w:r>
               <w:t>df</w:t>
             </w:r>
-            <w:proofErr w:type="spellEnd"/>
           </w:p>
         </w:tc>
         <w:tc>
@@ -9693,12 +9110,6 @@
         </w:tc>
       </w:tr>
       <w:tr>
-        <w:tblPrEx>
-          <w:tblCellMar>
-            <w:top w:w="0" w:type="dxa"/>
-            <w:bottom w:w="0" w:type="dxa"/>
-          </w:tblCellMar>
-        </w:tblPrEx>
         <w:trPr>
           <w:cantSplit/>
         </w:trPr>
@@ -9851,12 +9262,6 @@
         </w:tc>
       </w:tr>
       <w:tr>
-        <w:tblPrEx>
-          <w:tblCellMar>
-            <w:top w:w="0" w:type="dxa"/>
-            <w:bottom w:w="0" w:type="dxa"/>
-          </w:tblCellMar>
-        </w:tblPrEx>
         <w:trPr>
           <w:cantSplit/>
         </w:trPr>
@@ -9996,12 +9401,6 @@
         </w:tc>
       </w:tr>
       <w:tr>
-        <w:tblPrEx>
-          <w:tblCellMar>
-            <w:top w:w="0" w:type="dxa"/>
-            <w:bottom w:w="0" w:type="dxa"/>
-          </w:tblCellMar>
-        </w:tblPrEx>
         <w:trPr>
           <w:cantSplit/>
         </w:trPr>
@@ -10139,12 +9538,6 @@
         </w:tc>
       </w:tr>
       <w:tr>
-        <w:tblPrEx>
-          <w:tblCellMar>
-            <w:top w:w="0" w:type="dxa"/>
-            <w:bottom w:w="0" w:type="dxa"/>
-          </w:tblCellMar>
-        </w:tblPrEx>
         <w:trPr>
           <w:cantSplit/>
         </w:trPr>
@@ -10165,23 +9558,12 @@
               <w:spacing w:line="360" w:lineRule="auto"/>
             </w:pPr>
             <w:r>
-              <w:t xml:space="preserve">a. Dependent Variable: </w:t>
-            </w:r>
-            <w:proofErr w:type="spellStart"/>
-            <w:r>
-              <w:t>corr_highed</w:t>
-            </w:r>
-            <w:proofErr w:type="spellEnd"/>
+              <w:t>a. Dependent Variable: corr_highed</w:t>
+            </w:r>
           </w:p>
         </w:tc>
       </w:tr>
       <w:tr>
-        <w:tblPrEx>
-          <w:tblCellMar>
-            <w:top w:w="0" w:type="dxa"/>
-            <w:bottom w:w="0" w:type="dxa"/>
-          </w:tblCellMar>
-        </w:tblPrEx>
         <w:trPr>
           <w:cantSplit/>
         </w:trPr>
@@ -10202,61 +9584,8 @@
               <w:spacing w:line="360" w:lineRule="auto"/>
             </w:pPr>
             <w:r>
-              <w:t xml:space="preserve">b. Predictors: (Constant), Your highest level of completed </w:t>
-            </w:r>
-            <w:proofErr w:type="gramStart"/>
-            <w:r>
-              <w:t>education?,</w:t>
-            </w:r>
-            <w:proofErr w:type="gramEnd"/>
-            <w:r>
-              <w:t xml:space="preserve"> </w:t>
-            </w:r>
-            <w:proofErr w:type="spellStart"/>
-            <w:r>
-              <w:t>experience_index</w:t>
-            </w:r>
-            <w:proofErr w:type="spellEnd"/>
-            <w:r>
-              <w:t xml:space="preserve">, </w:t>
-            </w:r>
-            <w:proofErr w:type="spellStart"/>
-            <w:r>
-              <w:t>urban_rural</w:t>
-            </w:r>
-            <w:proofErr w:type="spellEnd"/>
-            <w:r>
-              <w:t xml:space="preserve">, Sex, </w:t>
-            </w:r>
-            <w:proofErr w:type="spellStart"/>
-            <w:r>
-              <w:t>state_capture</w:t>
-            </w:r>
-            <w:proofErr w:type="spellEnd"/>
-            <w:r>
-              <w:t xml:space="preserve">, How old are you?, </w:t>
-            </w:r>
-            <w:proofErr w:type="spellStart"/>
-            <w:r>
-              <w:t>distrust_highed</w:t>
-            </w:r>
-            <w:proofErr w:type="spellEnd"/>
-            <w:r>
-              <w:t xml:space="preserve">, </w:t>
-            </w:r>
-            <w:proofErr w:type="spellStart"/>
-            <w:r>
-              <w:t>tolerance_index</w:t>
-            </w:r>
-            <w:proofErr w:type="spellEnd"/>
-            <w:r>
-              <w:t xml:space="preserve">, </w:t>
-            </w:r>
-            <w:proofErr w:type="spellStart"/>
-            <w:r>
-              <w:t>urban_town</w:t>
-            </w:r>
-            <w:proofErr w:type="spellEnd"/>
+              <w:t>b. Predictors: (Constant), Your highest level of completed education?, experience_index, urban_rural, Sex, state_capture, How old are you?, distrust_highed, tolerance_index, urban_town</w:t>
+            </w:r>
           </w:p>
         </w:tc>
       </w:tr>
@@ -10291,12 +9620,6 @@
         <w:gridCol w:w="1025"/>
       </w:tblGrid>
       <w:tr>
-        <w:tblPrEx>
-          <w:tblCellMar>
-            <w:top w:w="0" w:type="dxa"/>
-            <w:bottom w:w="0" w:type="dxa"/>
-          </w:tblCellMar>
-        </w:tblPrEx>
         <w:trPr>
           <w:cantSplit/>
         </w:trPr>
@@ -10317,7 +9640,6 @@
             <w:pPr>
               <w:spacing w:line="360" w:lineRule="auto"/>
             </w:pPr>
-            <w:proofErr w:type="spellStart"/>
             <w:r>
               <w:rPr>
                 <w:b/>
@@ -10333,17 +9655,10 @@
               </w:rPr>
               <w:t>a</w:t>
             </w:r>
-            <w:proofErr w:type="spellEnd"/>
           </w:p>
         </w:tc>
       </w:tr>
       <w:tr>
-        <w:tblPrEx>
-          <w:tblCellMar>
-            <w:top w:w="0" w:type="dxa"/>
-            <w:bottom w:w="0" w:type="dxa"/>
-          </w:tblCellMar>
-        </w:tblPrEx>
         <w:trPr>
           <w:cantSplit/>
         </w:trPr>
@@ -10459,12 +9774,6 @@
         </w:tc>
       </w:tr>
       <w:tr>
-        <w:tblPrEx>
-          <w:tblCellMar>
-            <w:top w:w="0" w:type="dxa"/>
-            <w:bottom w:w="0" w:type="dxa"/>
-          </w:tblCellMar>
-        </w:tblPrEx>
         <w:trPr>
           <w:cantSplit/>
         </w:trPr>
@@ -10591,12 +9900,6 @@
         </w:tc>
       </w:tr>
       <w:tr>
-        <w:tblPrEx>
-          <w:tblCellMar>
-            <w:top w:w="0" w:type="dxa"/>
-            <w:bottom w:w="0" w:type="dxa"/>
-          </w:tblCellMar>
-        </w:tblPrEx>
         <w:trPr>
           <w:cantSplit/>
         </w:trPr>
@@ -10741,12 +10044,6 @@
         </w:tc>
       </w:tr>
       <w:tr>
-        <w:tblPrEx>
-          <w:tblCellMar>
-            <w:top w:w="0" w:type="dxa"/>
-            <w:bottom w:w="0" w:type="dxa"/>
-          </w:tblCellMar>
-        </w:tblPrEx>
         <w:trPr>
           <w:cantSplit/>
         </w:trPr>
@@ -10783,11 +10080,9 @@
             <w:pPr>
               <w:spacing w:line="360" w:lineRule="auto"/>
             </w:pPr>
-            <w:proofErr w:type="spellStart"/>
             <w:r>
               <w:t>tolerance_index</w:t>
             </w:r>
-            <w:proofErr w:type="spellEnd"/>
           </w:p>
         </w:tc>
         <w:tc>
@@ -10892,12 +10187,6 @@
         </w:tc>
       </w:tr>
       <w:tr>
-        <w:tblPrEx>
-          <w:tblCellMar>
-            <w:top w:w="0" w:type="dxa"/>
-            <w:bottom w:w="0" w:type="dxa"/>
-          </w:tblCellMar>
-        </w:tblPrEx>
         <w:trPr>
           <w:cantSplit/>
         </w:trPr>
@@ -10934,11 +10223,9 @@
             <w:pPr>
               <w:spacing w:line="360" w:lineRule="auto"/>
             </w:pPr>
-            <w:proofErr w:type="spellStart"/>
             <w:r>
               <w:t>experience_index</w:t>
             </w:r>
-            <w:proofErr w:type="spellEnd"/>
           </w:p>
         </w:tc>
         <w:tc>
@@ -11043,12 +10330,6 @@
         </w:tc>
       </w:tr>
       <w:tr>
-        <w:tblPrEx>
-          <w:tblCellMar>
-            <w:top w:w="0" w:type="dxa"/>
-            <w:bottom w:w="0" w:type="dxa"/>
-          </w:tblCellMar>
-        </w:tblPrEx>
         <w:trPr>
           <w:cantSplit/>
         </w:trPr>
@@ -11085,11 +10366,9 @@
             <w:pPr>
               <w:spacing w:line="360" w:lineRule="auto"/>
             </w:pPr>
-            <w:proofErr w:type="spellStart"/>
             <w:r>
               <w:t>distrust_highed</w:t>
             </w:r>
-            <w:proofErr w:type="spellEnd"/>
           </w:p>
         </w:tc>
         <w:tc>
@@ -11194,12 +10473,6 @@
         </w:tc>
       </w:tr>
       <w:tr>
-        <w:tblPrEx>
-          <w:tblCellMar>
-            <w:top w:w="0" w:type="dxa"/>
-            <w:bottom w:w="0" w:type="dxa"/>
-          </w:tblCellMar>
-        </w:tblPrEx>
         <w:trPr>
           <w:cantSplit/>
         </w:trPr>
@@ -11236,11 +10509,9 @@
             <w:pPr>
               <w:spacing w:line="360" w:lineRule="auto"/>
             </w:pPr>
-            <w:proofErr w:type="spellStart"/>
             <w:r>
               <w:t>state_capture</w:t>
             </w:r>
-            <w:proofErr w:type="spellEnd"/>
           </w:p>
         </w:tc>
         <w:tc>
@@ -11345,12 +10616,6 @@
         </w:tc>
       </w:tr>
       <w:tr>
-        <w:tblPrEx>
-          <w:tblCellMar>
-            <w:top w:w="0" w:type="dxa"/>
-            <w:bottom w:w="0" w:type="dxa"/>
-          </w:tblCellMar>
-        </w:tblPrEx>
         <w:trPr>
           <w:cantSplit/>
         </w:trPr>
@@ -11387,11 +10652,9 @@
             <w:pPr>
               <w:spacing w:line="360" w:lineRule="auto"/>
             </w:pPr>
-            <w:proofErr w:type="spellStart"/>
             <w:r>
               <w:t>urban_town</w:t>
             </w:r>
-            <w:proofErr w:type="spellEnd"/>
           </w:p>
         </w:tc>
         <w:tc>
@@ -11496,12 +10759,6 @@
         </w:tc>
       </w:tr>
       <w:tr>
-        <w:tblPrEx>
-          <w:tblCellMar>
-            <w:top w:w="0" w:type="dxa"/>
-            <w:bottom w:w="0" w:type="dxa"/>
-          </w:tblCellMar>
-        </w:tblPrEx>
         <w:trPr>
           <w:cantSplit/>
         </w:trPr>
@@ -11538,11 +10795,9 @@
             <w:pPr>
               <w:spacing w:line="360" w:lineRule="auto"/>
             </w:pPr>
-            <w:proofErr w:type="spellStart"/>
             <w:r>
               <w:t>urban_rural</w:t>
             </w:r>
-            <w:proofErr w:type="spellEnd"/>
           </w:p>
         </w:tc>
         <w:tc>
@@ -11647,12 +10902,6 @@
         </w:tc>
       </w:tr>
       <w:tr>
-        <w:tblPrEx>
-          <w:tblCellMar>
-            <w:top w:w="0" w:type="dxa"/>
-            <w:bottom w:w="0" w:type="dxa"/>
-          </w:tblCellMar>
-        </w:tblPrEx>
         <w:trPr>
           <w:cantSplit/>
         </w:trPr>
@@ -11796,12 +11045,6 @@
         </w:tc>
       </w:tr>
       <w:tr>
-        <w:tblPrEx>
-          <w:tblCellMar>
-            <w:top w:w="0" w:type="dxa"/>
-            <w:bottom w:w="0" w:type="dxa"/>
-          </w:tblCellMar>
-        </w:tblPrEx>
         <w:trPr>
           <w:cantSplit/>
         </w:trPr>
@@ -11945,12 +11188,6 @@
         </w:tc>
       </w:tr>
       <w:tr>
-        <w:tblPrEx>
-          <w:tblCellMar>
-            <w:top w:w="0" w:type="dxa"/>
-            <w:bottom w:w="0" w:type="dxa"/>
-          </w:tblCellMar>
-        </w:tblPrEx>
         <w:trPr>
           <w:cantSplit/>
         </w:trPr>
@@ -12094,12 +11331,6 @@
         </w:tc>
       </w:tr>
       <w:tr>
-        <w:tblPrEx>
-          <w:tblCellMar>
-            <w:top w:w="0" w:type="dxa"/>
-            <w:bottom w:w="0" w:type="dxa"/>
-          </w:tblCellMar>
-        </w:tblPrEx>
         <w:trPr>
           <w:cantSplit/>
         </w:trPr>
@@ -12120,13 +11351,8 @@
               <w:spacing w:line="360" w:lineRule="auto"/>
             </w:pPr>
             <w:r>
-              <w:t xml:space="preserve">a. Dependent Variable: </w:t>
-            </w:r>
-            <w:proofErr w:type="spellStart"/>
-            <w:r>
-              <w:t>corr_highed</w:t>
-            </w:r>
-            <w:proofErr w:type="spellEnd"/>
+              <w:t>a. Dependent Variable: corr_highed</w:t>
+            </w:r>
           </w:p>
         </w:tc>
       </w:tr>
@@ -12141,7 +11367,11 @@
         <w:spacing w:line="360" w:lineRule="auto"/>
       </w:pPr>
       <w:r>
-        <w:t>Finally, robustness checks using general corruption perceptions as the dependent variable yield consistent results. The explanatory power of the model increases further (R² = 0.443), and state capture becomes the dominant predictor (β = 0.464, p &lt; 0.001), followed by institutional distrust (β = 0.329, p &lt; 0.001). Corruption tolerance remains statistically significant, while personal experience loses significance in this broader specification. Geographic effects are partially attenuated but remain relevant, particularly for respondents residing in towns. These results confirm that the determinants identified for higher education corruption perceptions are embedded within a wider structure of perceived systemic corruption</w:t>
+        <w:t xml:space="preserve">Finally, robustness checks using general corruption perceptions as the dependent variable yield consistent results. The explanatory power of the model increases further (R² = 0.443), and state </w:t>
+      </w:r>
+      <w:r>
+        <w:lastRenderedPageBreak/>
+        <w:t>capture becomes the dominant predictor (β = 0.464, p &lt; 0.001), followed by institutional distrust (β = 0.329, p &lt; 0.001). Corruption tolerance remains statistically significant, while personal experience loses significance in this broader specification. Geographic effects are partially attenuated but remain relevant, particularly for respondents residing in towns. These results confirm that the determinants identified for higher education corruption perceptions are embedded within a wider structure of perceived systemic corruption</w:t>
       </w:r>
     </w:p>
     <w:p>
@@ -12167,12 +11397,6 @@
         <w:gridCol w:w="1469"/>
       </w:tblGrid>
       <w:tr>
-        <w:tblPrEx>
-          <w:tblCellMar>
-            <w:top w:w="0" w:type="dxa"/>
-            <w:bottom w:w="0" w:type="dxa"/>
-          </w:tblCellMar>
-        </w:tblPrEx>
         <w:trPr>
           <w:cantSplit/>
         </w:trPr>
@@ -12204,12 +11428,6 @@
         </w:tc>
       </w:tr>
       <w:tr>
-        <w:tblPrEx>
-          <w:tblCellMar>
-            <w:top w:w="0" w:type="dxa"/>
-            <w:bottom w:w="0" w:type="dxa"/>
-          </w:tblCellMar>
-        </w:tblPrEx>
         <w:trPr>
           <w:cantSplit/>
         </w:trPr>
@@ -12320,12 +11538,6 @@
         </w:tc>
       </w:tr>
       <w:tr>
-        <w:tblPrEx>
-          <w:tblCellMar>
-            <w:top w:w="0" w:type="dxa"/>
-            <w:bottom w:w="0" w:type="dxa"/>
-          </w:tblCellMar>
-        </w:tblPrEx>
         <w:trPr>
           <w:cantSplit/>
         </w:trPr>
@@ -12437,12 +11649,6 @@
         </w:tc>
       </w:tr>
       <w:tr>
-        <w:tblPrEx>
-          <w:tblCellMar>
-            <w:top w:w="0" w:type="dxa"/>
-            <w:bottom w:w="0" w:type="dxa"/>
-          </w:tblCellMar>
-        </w:tblPrEx>
         <w:trPr>
           <w:cantSplit/>
         </w:trPr>
@@ -12463,61 +11669,8 @@
               <w:spacing w:line="360" w:lineRule="auto"/>
             </w:pPr>
             <w:r>
-              <w:t xml:space="preserve">a. Predictors: (Constant), Your highest level of completed </w:t>
-            </w:r>
-            <w:proofErr w:type="gramStart"/>
-            <w:r>
-              <w:t>education?,</w:t>
-            </w:r>
-            <w:proofErr w:type="gramEnd"/>
-            <w:r>
-              <w:t xml:space="preserve"> </w:t>
-            </w:r>
-            <w:proofErr w:type="spellStart"/>
-            <w:r>
-              <w:t>experience_index</w:t>
-            </w:r>
-            <w:proofErr w:type="spellEnd"/>
-            <w:r>
-              <w:t xml:space="preserve">, </w:t>
-            </w:r>
-            <w:proofErr w:type="spellStart"/>
-            <w:r>
-              <w:t>urban_rural</w:t>
-            </w:r>
-            <w:proofErr w:type="spellEnd"/>
-            <w:r>
-              <w:t xml:space="preserve">, Sex, </w:t>
-            </w:r>
-            <w:proofErr w:type="spellStart"/>
-            <w:r>
-              <w:t>state_capture</w:t>
-            </w:r>
-            <w:proofErr w:type="spellEnd"/>
-            <w:r>
-              <w:t xml:space="preserve">, How old are you?, </w:t>
-            </w:r>
-            <w:proofErr w:type="spellStart"/>
-            <w:r>
-              <w:t>distrust_highed</w:t>
-            </w:r>
-            <w:proofErr w:type="spellEnd"/>
-            <w:r>
-              <w:t xml:space="preserve">, </w:t>
-            </w:r>
-            <w:proofErr w:type="spellStart"/>
-            <w:r>
-              <w:t>tolerance_index</w:t>
-            </w:r>
-            <w:proofErr w:type="spellEnd"/>
-            <w:r>
-              <w:t xml:space="preserve">, </w:t>
-            </w:r>
-            <w:proofErr w:type="spellStart"/>
-            <w:r>
-              <w:t>urban_town</w:t>
-            </w:r>
-            <w:proofErr w:type="spellEnd"/>
+              <w:t>a. Predictors: (Constant), Your highest level of completed education?, experience_index, urban_rural, Sex, state_capture, How old are you?, distrust_highed, tolerance_index, urban_town</w:t>
+            </w:r>
           </w:p>
         </w:tc>
       </w:tr>
@@ -12552,12 +11705,6 @@
         <w:gridCol w:w="1025"/>
       </w:tblGrid>
       <w:tr>
-        <w:tblPrEx>
-          <w:tblCellMar>
-            <w:top w:w="0" w:type="dxa"/>
-            <w:bottom w:w="0" w:type="dxa"/>
-          </w:tblCellMar>
-        </w:tblPrEx>
         <w:trPr>
           <w:cantSplit/>
         </w:trPr>
@@ -12578,7 +11725,6 @@
             <w:pPr>
               <w:spacing w:line="360" w:lineRule="auto"/>
             </w:pPr>
-            <w:proofErr w:type="spellStart"/>
             <w:r>
               <w:rPr>
                 <w:b/>
@@ -12594,17 +11740,10 @@
               </w:rPr>
               <w:t>a</w:t>
             </w:r>
-            <w:proofErr w:type="spellEnd"/>
           </w:p>
         </w:tc>
       </w:tr>
       <w:tr>
-        <w:tblPrEx>
-          <w:tblCellMar>
-            <w:top w:w="0" w:type="dxa"/>
-            <w:bottom w:w="0" w:type="dxa"/>
-          </w:tblCellMar>
-        </w:tblPrEx>
         <w:trPr>
           <w:cantSplit/>
         </w:trPr>
@@ -12667,11 +11806,9 @@
             <w:pPr>
               <w:spacing w:line="360" w:lineRule="auto"/>
             </w:pPr>
-            <w:proofErr w:type="spellStart"/>
             <w:r>
               <w:t>df</w:t>
             </w:r>
-            <w:proofErr w:type="spellEnd"/>
           </w:p>
         </w:tc>
         <w:tc>
@@ -12739,12 +11876,6 @@
         </w:tc>
       </w:tr>
       <w:tr>
-        <w:tblPrEx>
-          <w:tblCellMar>
-            <w:top w:w="0" w:type="dxa"/>
-            <w:bottom w:w="0" w:type="dxa"/>
-          </w:tblCellMar>
-        </w:tblPrEx>
         <w:trPr>
           <w:cantSplit/>
         </w:trPr>
@@ -12897,12 +12028,6 @@
         </w:tc>
       </w:tr>
       <w:tr>
-        <w:tblPrEx>
-          <w:tblCellMar>
-            <w:top w:w="0" w:type="dxa"/>
-            <w:bottom w:w="0" w:type="dxa"/>
-          </w:tblCellMar>
-        </w:tblPrEx>
         <w:trPr>
           <w:cantSplit/>
         </w:trPr>
@@ -13042,12 +12167,6 @@
         </w:tc>
       </w:tr>
       <w:tr>
-        <w:tblPrEx>
-          <w:tblCellMar>
-            <w:top w:w="0" w:type="dxa"/>
-            <w:bottom w:w="0" w:type="dxa"/>
-          </w:tblCellMar>
-        </w:tblPrEx>
         <w:trPr>
           <w:cantSplit/>
         </w:trPr>
@@ -13185,12 +12304,6 @@
         </w:tc>
       </w:tr>
       <w:tr>
-        <w:tblPrEx>
-          <w:tblCellMar>
-            <w:top w:w="0" w:type="dxa"/>
-            <w:bottom w:w="0" w:type="dxa"/>
-          </w:tblCellMar>
-        </w:tblPrEx>
         <w:trPr>
           <w:cantSplit/>
         </w:trPr>
@@ -13211,23 +12324,12 @@
               <w:spacing w:line="360" w:lineRule="auto"/>
             </w:pPr>
             <w:r>
-              <w:t xml:space="preserve">a. Dependent Variable: </w:t>
-            </w:r>
-            <w:proofErr w:type="spellStart"/>
-            <w:r>
-              <w:t>corr_general</w:t>
-            </w:r>
-            <w:proofErr w:type="spellEnd"/>
+              <w:t>a. Dependent Variable: corr_general</w:t>
+            </w:r>
           </w:p>
         </w:tc>
       </w:tr>
       <w:tr>
-        <w:tblPrEx>
-          <w:tblCellMar>
-            <w:top w:w="0" w:type="dxa"/>
-            <w:bottom w:w="0" w:type="dxa"/>
-          </w:tblCellMar>
-        </w:tblPrEx>
         <w:trPr>
           <w:cantSplit/>
         </w:trPr>
@@ -13248,61 +12350,8 @@
               <w:spacing w:line="360" w:lineRule="auto"/>
             </w:pPr>
             <w:r>
-              <w:t xml:space="preserve">b. Predictors: (Constant), Your highest level of completed </w:t>
-            </w:r>
-            <w:proofErr w:type="gramStart"/>
-            <w:r>
-              <w:t>education?,</w:t>
-            </w:r>
-            <w:proofErr w:type="gramEnd"/>
-            <w:r>
-              <w:t xml:space="preserve"> </w:t>
-            </w:r>
-            <w:proofErr w:type="spellStart"/>
-            <w:r>
-              <w:t>experience_index</w:t>
-            </w:r>
-            <w:proofErr w:type="spellEnd"/>
-            <w:r>
-              <w:t xml:space="preserve">, </w:t>
-            </w:r>
-            <w:proofErr w:type="spellStart"/>
-            <w:r>
-              <w:t>urban_rural</w:t>
-            </w:r>
-            <w:proofErr w:type="spellEnd"/>
-            <w:r>
-              <w:t xml:space="preserve">, Sex, </w:t>
-            </w:r>
-            <w:proofErr w:type="spellStart"/>
-            <w:r>
-              <w:t>state_capture</w:t>
-            </w:r>
-            <w:proofErr w:type="spellEnd"/>
-            <w:r>
-              <w:t xml:space="preserve">, How old are you?, </w:t>
-            </w:r>
-            <w:proofErr w:type="spellStart"/>
-            <w:r>
-              <w:t>distrust_highed</w:t>
-            </w:r>
-            <w:proofErr w:type="spellEnd"/>
-            <w:r>
-              <w:t xml:space="preserve">, </w:t>
-            </w:r>
-            <w:proofErr w:type="spellStart"/>
-            <w:r>
-              <w:t>tolerance_index</w:t>
-            </w:r>
-            <w:proofErr w:type="spellEnd"/>
-            <w:r>
-              <w:t xml:space="preserve">, </w:t>
-            </w:r>
-            <w:proofErr w:type="spellStart"/>
-            <w:r>
-              <w:t>urban_town</w:t>
-            </w:r>
-            <w:proofErr w:type="spellEnd"/>
+              <w:t>b. Predictors: (Constant), Your highest level of completed education?, experience_index, urban_rural, Sex, state_capture, How old are you?, distrust_highed, tolerance_index, urban_town</w:t>
+            </w:r>
           </w:p>
         </w:tc>
       </w:tr>
@@ -13337,12 +12386,6 @@
         <w:gridCol w:w="1025"/>
       </w:tblGrid>
       <w:tr>
-        <w:tblPrEx>
-          <w:tblCellMar>
-            <w:top w:w="0" w:type="dxa"/>
-            <w:bottom w:w="0" w:type="dxa"/>
-          </w:tblCellMar>
-        </w:tblPrEx>
         <w:trPr>
           <w:cantSplit/>
         </w:trPr>
@@ -13363,7 +12406,6 @@
             <w:pPr>
               <w:spacing w:line="360" w:lineRule="auto"/>
             </w:pPr>
-            <w:proofErr w:type="spellStart"/>
             <w:r>
               <w:rPr>
                 <w:b/>
@@ -13379,17 +12421,10 @@
               </w:rPr>
               <w:t>a</w:t>
             </w:r>
-            <w:proofErr w:type="spellEnd"/>
           </w:p>
         </w:tc>
       </w:tr>
       <w:tr>
-        <w:tblPrEx>
-          <w:tblCellMar>
-            <w:top w:w="0" w:type="dxa"/>
-            <w:bottom w:w="0" w:type="dxa"/>
-          </w:tblCellMar>
-        </w:tblPrEx>
         <w:trPr>
           <w:cantSplit/>
         </w:trPr>
@@ -13412,6 +12447,7 @@
               <w:spacing w:line="360" w:lineRule="auto"/>
             </w:pPr>
             <w:r>
+              <w:lastRenderedPageBreak/>
               <w:t>Model</w:t>
             </w:r>
           </w:p>
@@ -13505,12 +12541,6 @@
         </w:tc>
       </w:tr>
       <w:tr>
-        <w:tblPrEx>
-          <w:tblCellMar>
-            <w:top w:w="0" w:type="dxa"/>
-            <w:bottom w:w="0" w:type="dxa"/>
-          </w:tblCellMar>
-        </w:tblPrEx>
         <w:trPr>
           <w:cantSplit/>
         </w:trPr>
@@ -13637,12 +12667,6 @@
         </w:tc>
       </w:tr>
       <w:tr>
-        <w:tblPrEx>
-          <w:tblCellMar>
-            <w:top w:w="0" w:type="dxa"/>
-            <w:bottom w:w="0" w:type="dxa"/>
-          </w:tblCellMar>
-        </w:tblPrEx>
         <w:trPr>
           <w:cantSplit/>
         </w:trPr>
@@ -13787,12 +12811,6 @@
         </w:tc>
       </w:tr>
       <w:tr>
-        <w:tblPrEx>
-          <w:tblCellMar>
-            <w:top w:w="0" w:type="dxa"/>
-            <w:bottom w:w="0" w:type="dxa"/>
-          </w:tblCellMar>
-        </w:tblPrEx>
         <w:trPr>
           <w:cantSplit/>
         </w:trPr>
@@ -13829,11 +12847,9 @@
             <w:pPr>
               <w:spacing w:line="360" w:lineRule="auto"/>
             </w:pPr>
-            <w:proofErr w:type="spellStart"/>
             <w:r>
               <w:t>tolerance_index</w:t>
             </w:r>
-            <w:proofErr w:type="spellEnd"/>
           </w:p>
         </w:tc>
         <w:tc>
@@ -13938,12 +12954,6 @@
         </w:tc>
       </w:tr>
       <w:tr>
-        <w:tblPrEx>
-          <w:tblCellMar>
-            <w:top w:w="0" w:type="dxa"/>
-            <w:bottom w:w="0" w:type="dxa"/>
-          </w:tblCellMar>
-        </w:tblPrEx>
         <w:trPr>
           <w:cantSplit/>
         </w:trPr>
@@ -13980,11 +12990,9 @@
             <w:pPr>
               <w:spacing w:line="360" w:lineRule="auto"/>
             </w:pPr>
-            <w:proofErr w:type="spellStart"/>
             <w:r>
               <w:t>experience_index</w:t>
             </w:r>
-            <w:proofErr w:type="spellEnd"/>
           </w:p>
         </w:tc>
         <w:tc>
@@ -14089,12 +13097,6 @@
         </w:tc>
       </w:tr>
       <w:tr>
-        <w:tblPrEx>
-          <w:tblCellMar>
-            <w:top w:w="0" w:type="dxa"/>
-            <w:bottom w:w="0" w:type="dxa"/>
-          </w:tblCellMar>
-        </w:tblPrEx>
         <w:trPr>
           <w:cantSplit/>
         </w:trPr>
@@ -14131,11 +13133,9 @@
             <w:pPr>
               <w:spacing w:line="360" w:lineRule="auto"/>
             </w:pPr>
-            <w:proofErr w:type="spellStart"/>
             <w:r>
               <w:t>distrust_highed</w:t>
             </w:r>
-            <w:proofErr w:type="spellEnd"/>
           </w:p>
         </w:tc>
         <w:tc>
@@ -14240,12 +13240,6 @@
         </w:tc>
       </w:tr>
       <w:tr>
-        <w:tblPrEx>
-          <w:tblCellMar>
-            <w:top w:w="0" w:type="dxa"/>
-            <w:bottom w:w="0" w:type="dxa"/>
-          </w:tblCellMar>
-        </w:tblPrEx>
         <w:trPr>
           <w:cantSplit/>
         </w:trPr>
@@ -14282,11 +13276,9 @@
             <w:pPr>
               <w:spacing w:line="360" w:lineRule="auto"/>
             </w:pPr>
-            <w:proofErr w:type="spellStart"/>
             <w:r>
               <w:t>state_capture</w:t>
             </w:r>
-            <w:proofErr w:type="spellEnd"/>
           </w:p>
         </w:tc>
         <w:tc>
@@ -14391,12 +13383,6 @@
         </w:tc>
       </w:tr>
       <w:tr>
-        <w:tblPrEx>
-          <w:tblCellMar>
-            <w:top w:w="0" w:type="dxa"/>
-            <w:bottom w:w="0" w:type="dxa"/>
-          </w:tblCellMar>
-        </w:tblPrEx>
         <w:trPr>
           <w:cantSplit/>
         </w:trPr>
@@ -14433,11 +13419,9 @@
             <w:pPr>
               <w:spacing w:line="360" w:lineRule="auto"/>
             </w:pPr>
-            <w:proofErr w:type="spellStart"/>
             <w:r>
               <w:t>urban_town</w:t>
             </w:r>
-            <w:proofErr w:type="spellEnd"/>
           </w:p>
         </w:tc>
         <w:tc>
@@ -14542,12 +13526,6 @@
         </w:tc>
       </w:tr>
       <w:tr>
-        <w:tblPrEx>
-          <w:tblCellMar>
-            <w:top w:w="0" w:type="dxa"/>
-            <w:bottom w:w="0" w:type="dxa"/>
-          </w:tblCellMar>
-        </w:tblPrEx>
         <w:trPr>
           <w:cantSplit/>
         </w:trPr>
@@ -14584,11 +13562,9 @@
             <w:pPr>
               <w:spacing w:line="360" w:lineRule="auto"/>
             </w:pPr>
-            <w:proofErr w:type="spellStart"/>
             <w:r>
               <w:t>urban_rural</w:t>
             </w:r>
-            <w:proofErr w:type="spellEnd"/>
           </w:p>
         </w:tc>
         <w:tc>
@@ -14693,12 +13669,6 @@
         </w:tc>
       </w:tr>
       <w:tr>
-        <w:tblPrEx>
-          <w:tblCellMar>
-            <w:top w:w="0" w:type="dxa"/>
-            <w:bottom w:w="0" w:type="dxa"/>
-          </w:tblCellMar>
-        </w:tblPrEx>
         <w:trPr>
           <w:cantSplit/>
         </w:trPr>
@@ -14842,12 +13812,6 @@
         </w:tc>
       </w:tr>
       <w:tr>
-        <w:tblPrEx>
-          <w:tblCellMar>
-            <w:top w:w="0" w:type="dxa"/>
-            <w:bottom w:w="0" w:type="dxa"/>
-          </w:tblCellMar>
-        </w:tblPrEx>
         <w:trPr>
           <w:cantSplit/>
         </w:trPr>
@@ -14991,12 +13955,6 @@
         </w:tc>
       </w:tr>
       <w:tr>
-        <w:tblPrEx>
-          <w:tblCellMar>
-            <w:top w:w="0" w:type="dxa"/>
-            <w:bottom w:w="0" w:type="dxa"/>
-          </w:tblCellMar>
-        </w:tblPrEx>
         <w:trPr>
           <w:cantSplit/>
         </w:trPr>
@@ -15140,12 +14098,6 @@
         </w:tc>
       </w:tr>
       <w:tr>
-        <w:tblPrEx>
-          <w:tblCellMar>
-            <w:top w:w="0" w:type="dxa"/>
-            <w:bottom w:w="0" w:type="dxa"/>
-          </w:tblCellMar>
-        </w:tblPrEx>
         <w:trPr>
           <w:cantSplit/>
         </w:trPr>
@@ -15166,13 +14118,8 @@
               <w:spacing w:line="360" w:lineRule="auto"/>
             </w:pPr>
             <w:r>
-              <w:t xml:space="preserve">a. Dependent Variable: </w:t>
-            </w:r>
-            <w:proofErr w:type="spellStart"/>
-            <w:r>
-              <w:t>corr_general</w:t>
-            </w:r>
-            <w:proofErr w:type="spellEnd"/>
+              <w:t>a. Dependent Variable: corr_general</w:t>
+            </w:r>
           </w:p>
         </w:tc>
       </w:tr>
@@ -15656,20 +14603,8 @@
                 <w:szCs w:val="22"/>
                 <w:lang w:eastAsia="en-US"/>
               </w:rPr>
-              <w:t xml:space="preserve">{1, Almost everybody is </w:t>
-            </w:r>
-            <w:proofErr w:type="gramStart"/>
-            <w:r>
-              <w:rPr>
-                <w:rFonts w:ascii="Aptos Narrow" w:eastAsia="Times New Roman" w:hAnsi="Aptos Narrow" w:cs="Times New Roman"/>
-                <w:color w:val="000000"/>
-                <w:sz w:val="22"/>
-                <w:szCs w:val="22"/>
-                <w:lang w:eastAsia="en-US"/>
-              </w:rPr>
-              <w:t>involved}...</w:t>
-            </w:r>
-            <w:proofErr w:type="gramEnd"/>
+              <w:t>{1, Almost everybody is involved}...</w:t>
+            </w:r>
           </w:p>
         </w:tc>
         <w:tc>
@@ -15867,20 +14802,8 @@
                 <w:szCs w:val="22"/>
                 <w:lang w:eastAsia="en-US"/>
               </w:rPr>
-              <w:t xml:space="preserve">{1, Almost everybody is </w:t>
-            </w:r>
-            <w:proofErr w:type="gramStart"/>
-            <w:r>
-              <w:rPr>
-                <w:rFonts w:ascii="Aptos Narrow" w:eastAsia="Times New Roman" w:hAnsi="Aptos Narrow" w:cs="Times New Roman"/>
-                <w:color w:val="000000"/>
-                <w:sz w:val="22"/>
-                <w:szCs w:val="22"/>
-                <w:lang w:eastAsia="en-US"/>
-              </w:rPr>
-              <w:t>involved}...</w:t>
-            </w:r>
-            <w:proofErr w:type="gramEnd"/>
+              <w:t>{1, Almost everybody is involved}...</w:t>
+            </w:r>
           </w:p>
         </w:tc>
         <w:tc>
@@ -16078,20 +15001,8 @@
                 <w:szCs w:val="22"/>
                 <w:lang w:eastAsia="en-US"/>
               </w:rPr>
-              <w:t xml:space="preserve">{1, </w:t>
-            </w:r>
-            <w:proofErr w:type="gramStart"/>
-            <w:r>
-              <w:rPr>
-                <w:rFonts w:ascii="Aptos Narrow" w:eastAsia="Times New Roman" w:hAnsi="Aptos Narrow" w:cs="Times New Roman"/>
-                <w:color w:val="000000"/>
-                <w:sz w:val="22"/>
-                <w:szCs w:val="22"/>
-                <w:lang w:eastAsia="en-US"/>
-              </w:rPr>
-              <w:t>Acceptable}...</w:t>
-            </w:r>
-            <w:proofErr w:type="gramEnd"/>
+              <w:t>{1, Acceptable}...</w:t>
+            </w:r>
           </w:p>
         </w:tc>
         <w:tc>
@@ -16289,20 +15200,8 @@
                 <w:szCs w:val="22"/>
                 <w:lang w:eastAsia="en-US"/>
               </w:rPr>
-              <w:t xml:space="preserve">{1, </w:t>
-            </w:r>
-            <w:proofErr w:type="gramStart"/>
-            <w:r>
-              <w:rPr>
-                <w:rFonts w:ascii="Aptos Narrow" w:eastAsia="Times New Roman" w:hAnsi="Aptos Narrow" w:cs="Times New Roman"/>
-                <w:color w:val="000000"/>
-                <w:sz w:val="22"/>
-                <w:szCs w:val="22"/>
-                <w:lang w:eastAsia="en-US"/>
-              </w:rPr>
-              <w:t>Acceptable}...</w:t>
-            </w:r>
-            <w:proofErr w:type="gramEnd"/>
+              <w:t>{1, Acceptable}...</w:t>
+            </w:r>
           </w:p>
         </w:tc>
         <w:tc>
@@ -16500,20 +15399,8 @@
                 <w:szCs w:val="22"/>
                 <w:lang w:eastAsia="en-US"/>
               </w:rPr>
-              <w:t xml:space="preserve">{1, </w:t>
-            </w:r>
-            <w:proofErr w:type="gramStart"/>
-            <w:r>
-              <w:rPr>
-                <w:rFonts w:ascii="Aptos Narrow" w:eastAsia="Times New Roman" w:hAnsi="Aptos Narrow" w:cs="Times New Roman"/>
-                <w:color w:val="000000"/>
-                <w:sz w:val="22"/>
-                <w:szCs w:val="22"/>
-                <w:lang w:eastAsia="en-US"/>
-              </w:rPr>
-              <w:t>Acceptable}...</w:t>
-            </w:r>
-            <w:proofErr w:type="gramEnd"/>
+              <w:t>{1, Acceptable}...</w:t>
+            </w:r>
           </w:p>
         </w:tc>
         <w:tc>
@@ -16590,6 +15477,7 @@
                 <w:szCs w:val="22"/>
                 <w:lang w:eastAsia="en-US"/>
               </w:rPr>
+              <w:lastRenderedPageBreak/>
               <w:t>A9D</w:t>
             </w:r>
           </w:p>
@@ -16711,20 +15599,8 @@
                 <w:szCs w:val="22"/>
                 <w:lang w:eastAsia="en-US"/>
               </w:rPr>
-              <w:t xml:space="preserve">{1, </w:t>
-            </w:r>
-            <w:proofErr w:type="gramStart"/>
-            <w:r>
-              <w:rPr>
-                <w:rFonts w:ascii="Aptos Narrow" w:eastAsia="Times New Roman" w:hAnsi="Aptos Narrow" w:cs="Times New Roman"/>
-                <w:color w:val="000000"/>
-                <w:sz w:val="22"/>
-                <w:szCs w:val="22"/>
-                <w:lang w:eastAsia="en-US"/>
-              </w:rPr>
-              <w:t>Acceptable}...</w:t>
-            </w:r>
-            <w:proofErr w:type="gramEnd"/>
+              <w:t>{1, Acceptable}...</w:t>
+            </w:r>
           </w:p>
         </w:tc>
         <w:tc>
@@ -16922,20 +15798,8 @@
                 <w:szCs w:val="22"/>
                 <w:lang w:eastAsia="en-US"/>
               </w:rPr>
-              <w:t xml:space="preserve">{1, </w:t>
-            </w:r>
-            <w:proofErr w:type="gramStart"/>
-            <w:r>
-              <w:rPr>
-                <w:rFonts w:ascii="Aptos Narrow" w:eastAsia="Times New Roman" w:hAnsi="Aptos Narrow" w:cs="Times New Roman"/>
-                <w:color w:val="000000"/>
-                <w:sz w:val="22"/>
-                <w:szCs w:val="22"/>
-                <w:lang w:eastAsia="en-US"/>
-              </w:rPr>
-              <w:t>Acceptable}...</w:t>
-            </w:r>
-            <w:proofErr w:type="gramEnd"/>
+              <w:t>{1, Acceptable}...</w:t>
+            </w:r>
           </w:p>
         </w:tc>
         <w:tc>
@@ -17133,20 +15997,8 @@
                 <w:szCs w:val="22"/>
                 <w:lang w:eastAsia="en-US"/>
               </w:rPr>
-              <w:t xml:space="preserve">{1, </w:t>
-            </w:r>
-            <w:proofErr w:type="gramStart"/>
-            <w:r>
-              <w:rPr>
-                <w:rFonts w:ascii="Aptos Narrow" w:eastAsia="Times New Roman" w:hAnsi="Aptos Narrow" w:cs="Times New Roman"/>
-                <w:color w:val="000000"/>
-                <w:sz w:val="22"/>
-                <w:szCs w:val="22"/>
-                <w:lang w:eastAsia="en-US"/>
-              </w:rPr>
-              <w:t>Acceptable}...</w:t>
-            </w:r>
-            <w:proofErr w:type="gramEnd"/>
+              <w:t>{1, Acceptable}...</w:t>
+            </w:r>
           </w:p>
         </w:tc>
         <w:tc>
@@ -17344,20 +16196,8 @@
                 <w:szCs w:val="22"/>
                 <w:lang w:eastAsia="en-US"/>
               </w:rPr>
-              <w:t xml:space="preserve">{1, </w:t>
-            </w:r>
-            <w:proofErr w:type="gramStart"/>
-            <w:r>
-              <w:rPr>
-                <w:rFonts w:ascii="Aptos Narrow" w:eastAsia="Times New Roman" w:hAnsi="Aptos Narrow" w:cs="Times New Roman"/>
-                <w:color w:val="000000"/>
-                <w:sz w:val="22"/>
-                <w:szCs w:val="22"/>
-                <w:lang w:eastAsia="en-US"/>
-              </w:rPr>
-              <w:t>Acceptable}...</w:t>
-            </w:r>
-            <w:proofErr w:type="gramEnd"/>
+              <w:t>{1, Acceptable}...</w:t>
+            </w:r>
           </w:p>
         </w:tc>
         <w:tc>
@@ -17555,20 +16395,8 @@
                 <w:szCs w:val="22"/>
                 <w:lang w:eastAsia="en-US"/>
               </w:rPr>
-              <w:t xml:space="preserve">{1, </w:t>
-            </w:r>
-            <w:proofErr w:type="gramStart"/>
-            <w:r>
-              <w:rPr>
-                <w:rFonts w:ascii="Aptos Narrow" w:eastAsia="Times New Roman" w:hAnsi="Aptos Narrow" w:cs="Times New Roman"/>
-                <w:color w:val="000000"/>
-                <w:sz w:val="22"/>
-                <w:szCs w:val="22"/>
-                <w:lang w:eastAsia="en-US"/>
-              </w:rPr>
-              <w:t>Acceptable}...</w:t>
-            </w:r>
-            <w:proofErr w:type="gramEnd"/>
+              <w:t>{1, Acceptable}...</w:t>
+            </w:r>
           </w:p>
         </w:tc>
         <w:tc>
@@ -17766,20 +16594,8 @@
                 <w:szCs w:val="22"/>
                 <w:lang w:eastAsia="en-US"/>
               </w:rPr>
-              <w:t xml:space="preserve">{1, Trust them </w:t>
-            </w:r>
-            <w:proofErr w:type="gramStart"/>
-            <w:r>
-              <w:rPr>
-                <w:rFonts w:ascii="Aptos Narrow" w:eastAsia="Times New Roman" w:hAnsi="Aptos Narrow" w:cs="Times New Roman"/>
-                <w:color w:val="000000"/>
-                <w:sz w:val="22"/>
-                <w:szCs w:val="22"/>
-                <w:lang w:eastAsia="en-US"/>
-              </w:rPr>
-              <w:t>completely}...</w:t>
-            </w:r>
-            <w:proofErr w:type="gramEnd"/>
+              <w:t>{1, Trust them completely}...</w:t>
+            </w:r>
           </w:p>
         </w:tc>
         <w:tc>
@@ -17977,20 +16793,8 @@
                 <w:szCs w:val="22"/>
                 <w:lang w:eastAsia="en-US"/>
               </w:rPr>
-              <w:t xml:space="preserve">{1, Trust them </w:t>
-            </w:r>
-            <w:proofErr w:type="gramStart"/>
-            <w:r>
-              <w:rPr>
-                <w:rFonts w:ascii="Aptos Narrow" w:eastAsia="Times New Roman" w:hAnsi="Aptos Narrow" w:cs="Times New Roman"/>
-                <w:color w:val="000000"/>
-                <w:sz w:val="22"/>
-                <w:szCs w:val="22"/>
-                <w:lang w:eastAsia="en-US"/>
-              </w:rPr>
-              <w:t>completely}...</w:t>
-            </w:r>
-            <w:proofErr w:type="gramEnd"/>
+              <w:t>{1, Trust them completely}...</w:t>
+            </w:r>
           </w:p>
         </w:tc>
         <w:tc>
@@ -18152,29 +16956,7 @@
                 <w:szCs w:val="22"/>
                 <w:lang w:eastAsia="en-US"/>
               </w:rPr>
-              <w:t xml:space="preserve">WHEN NEW LAWS ARE BEING PASSED IN BULGARIA....Laws are passed through "fast-track procedures" </w:t>
-            </w:r>
-            <w:proofErr w:type="gramStart"/>
-            <w:r>
-              <w:rPr>
-                <w:rFonts w:ascii="Aptos Narrow" w:eastAsia="Times New Roman" w:hAnsi="Aptos Narrow" w:cs="Times New Roman"/>
-                <w:color w:val="000000"/>
-                <w:sz w:val="22"/>
-                <w:szCs w:val="22"/>
-                <w:lang w:eastAsia="en-US"/>
-              </w:rPr>
-              <w:t>in order to</w:t>
-            </w:r>
-            <w:proofErr w:type="gramEnd"/>
-            <w:r>
-              <w:rPr>
-                <w:rFonts w:ascii="Aptos Narrow" w:eastAsia="Times New Roman" w:hAnsi="Aptos Narrow" w:cs="Times New Roman"/>
-                <w:color w:val="000000"/>
-                <w:sz w:val="22"/>
-                <w:szCs w:val="22"/>
-                <w:lang w:eastAsia="en-US"/>
-              </w:rPr>
-              <w:t xml:space="preserve"> avoid public consultation</w:t>
+              <w:t>WHEN NEW LAWS ARE BEING PASSED IN BULGARIA....Laws are passed through "fast-track procedures" in order to avoid public consultation</w:t>
             </w:r>
           </w:p>
         </w:tc>
@@ -18210,20 +16992,8 @@
                 <w:szCs w:val="22"/>
                 <w:lang w:eastAsia="en-US"/>
               </w:rPr>
-              <w:t xml:space="preserve">{1, Very </w:t>
-            </w:r>
-            <w:proofErr w:type="gramStart"/>
-            <w:r>
-              <w:rPr>
-                <w:rFonts w:ascii="Aptos Narrow" w:eastAsia="Times New Roman" w:hAnsi="Aptos Narrow" w:cs="Times New Roman"/>
-                <w:color w:val="000000"/>
-                <w:sz w:val="22"/>
-                <w:szCs w:val="22"/>
-                <w:lang w:eastAsia="en-US"/>
-              </w:rPr>
-              <w:t>often}...</w:t>
-            </w:r>
-            <w:proofErr w:type="gramEnd"/>
+              <w:t>{1, Very often}...</w:t>
+            </w:r>
           </w:p>
         </w:tc>
         <w:tc>
@@ -18421,20 +17191,8 @@
                 <w:szCs w:val="22"/>
                 <w:lang w:eastAsia="en-US"/>
               </w:rPr>
-              <w:t xml:space="preserve">{1, Completely </w:t>
-            </w:r>
-            <w:proofErr w:type="gramStart"/>
-            <w:r>
-              <w:rPr>
-                <w:rFonts w:ascii="Aptos Narrow" w:eastAsia="Times New Roman" w:hAnsi="Aptos Narrow" w:cs="Times New Roman"/>
-                <w:color w:val="000000"/>
-                <w:sz w:val="22"/>
-                <w:szCs w:val="22"/>
-                <w:lang w:eastAsia="en-US"/>
-              </w:rPr>
-              <w:t>agree}...</w:t>
-            </w:r>
-            <w:proofErr w:type="gramEnd"/>
+              <w:t>{1, Completely agree}...</w:t>
+            </w:r>
           </w:p>
         </w:tc>
         <w:tc>
@@ -18596,29 +17354,7 @@
                 <w:szCs w:val="22"/>
                 <w:lang w:eastAsia="en-US"/>
               </w:rPr>
-              <w:t xml:space="preserve">When government decisions are made in your country, whose interests are most often </w:t>
-            </w:r>
-            <w:proofErr w:type="gramStart"/>
-            <w:r>
-              <w:rPr>
-                <w:rFonts w:ascii="Aptos Narrow" w:eastAsia="Times New Roman" w:hAnsi="Aptos Narrow" w:cs="Times New Roman"/>
-                <w:color w:val="000000"/>
-                <w:sz w:val="22"/>
-                <w:szCs w:val="22"/>
-                <w:lang w:eastAsia="en-US"/>
-              </w:rPr>
-              <w:t>taken into account</w:t>
-            </w:r>
-            <w:proofErr w:type="gramEnd"/>
-            <w:r>
-              <w:rPr>
-                <w:rFonts w:ascii="Aptos Narrow" w:eastAsia="Times New Roman" w:hAnsi="Aptos Narrow" w:cs="Times New Roman"/>
-                <w:color w:val="000000"/>
-                <w:sz w:val="22"/>
-                <w:szCs w:val="22"/>
-                <w:lang w:eastAsia="en-US"/>
-              </w:rPr>
-              <w:t>?</w:t>
+              <w:t>When government decisions are made in your country, whose interests are most often taken into account?</w:t>
             </w:r>
           </w:p>
         </w:tc>
@@ -18654,20 +17390,8 @@
                 <w:szCs w:val="22"/>
                 <w:lang w:eastAsia="en-US"/>
               </w:rPr>
-              <w:t xml:space="preserve">{1, The </w:t>
-            </w:r>
-            <w:proofErr w:type="gramStart"/>
-            <w:r>
-              <w:rPr>
-                <w:rFonts w:ascii="Aptos Narrow" w:eastAsia="Times New Roman" w:hAnsi="Aptos Narrow" w:cs="Times New Roman"/>
-                <w:color w:val="000000"/>
-                <w:sz w:val="22"/>
-                <w:szCs w:val="22"/>
-                <w:lang w:eastAsia="en-US"/>
-              </w:rPr>
-              <w:t>public}...</w:t>
-            </w:r>
-            <w:proofErr w:type="gramEnd"/>
+              <w:t>{1, The public}...</w:t>
+            </w:r>
           </w:p>
         </w:tc>
         <w:tc>
@@ -18744,6 +17468,7 @@
                 <w:szCs w:val="22"/>
                 <w:lang w:eastAsia="en-US"/>
               </w:rPr>
+              <w:lastRenderedPageBreak/>
               <w:t>SC4</w:t>
             </w:r>
           </w:p>
@@ -18829,29 +17554,7 @@
                 <w:szCs w:val="22"/>
                 <w:lang w:eastAsia="en-US"/>
               </w:rPr>
-              <w:t xml:space="preserve">How often do you think public resources </w:t>
-            </w:r>
-            <w:proofErr w:type="gramStart"/>
-            <w:r>
-              <w:rPr>
-                <w:rFonts w:ascii="Aptos Narrow" w:eastAsia="Times New Roman" w:hAnsi="Aptos Narrow" w:cs="Times New Roman"/>
-                <w:color w:val="000000"/>
-                <w:sz w:val="22"/>
-                <w:szCs w:val="22"/>
-                <w:lang w:eastAsia="en-US"/>
-              </w:rPr>
-              <w:t>....are</w:t>
-            </w:r>
-            <w:proofErr w:type="gramEnd"/>
-            <w:r>
-              <w:rPr>
-                <w:rFonts w:ascii="Aptos Narrow" w:eastAsia="Times New Roman" w:hAnsi="Aptos Narrow" w:cs="Times New Roman"/>
-                <w:color w:val="000000"/>
-                <w:sz w:val="22"/>
-                <w:szCs w:val="22"/>
-                <w:lang w:eastAsia="en-US"/>
-              </w:rPr>
-              <w:t xml:space="preserve"> managed or sold in a way that benefits a small group of people rather than the public?</w:t>
+              <w:t>How often do you think public resources ....are managed or sold in a way that benefits a small group of people rather than the public?</w:t>
             </w:r>
           </w:p>
         </w:tc>
@@ -18887,20 +17590,8 @@
                 <w:szCs w:val="22"/>
                 <w:lang w:eastAsia="en-US"/>
               </w:rPr>
-              <w:t xml:space="preserve">{1, Very </w:t>
-            </w:r>
-            <w:proofErr w:type="gramStart"/>
-            <w:r>
-              <w:rPr>
-                <w:rFonts w:ascii="Aptos Narrow" w:eastAsia="Times New Roman" w:hAnsi="Aptos Narrow" w:cs="Times New Roman"/>
-                <w:color w:val="000000"/>
-                <w:sz w:val="22"/>
-                <w:szCs w:val="22"/>
-                <w:lang w:eastAsia="en-US"/>
-              </w:rPr>
-              <w:t>often}...</w:t>
-            </w:r>
-            <w:proofErr w:type="gramEnd"/>
+              <w:t>{1, Very often}...</w:t>
+            </w:r>
           </w:p>
         </w:tc>
         <w:tc>
@@ -19098,20 +17789,8 @@
                 <w:szCs w:val="22"/>
                 <w:lang w:eastAsia="en-US"/>
               </w:rPr>
-              <w:t xml:space="preserve">{1, </w:t>
-            </w:r>
-            <w:proofErr w:type="gramStart"/>
-            <w:r>
-              <w:rPr>
-                <w:rFonts w:ascii="Aptos Narrow" w:eastAsia="Times New Roman" w:hAnsi="Aptos Narrow" w:cs="Times New Roman"/>
-                <w:color w:val="000000"/>
-                <w:sz w:val="22"/>
-                <w:szCs w:val="22"/>
-                <w:lang w:eastAsia="en-US"/>
-              </w:rPr>
-              <w:t>Male}...</w:t>
-            </w:r>
-            <w:proofErr w:type="gramEnd"/>
+              <w:t>{1, Male}...</w:t>
+            </w:r>
           </w:p>
         </w:tc>
         <w:tc>
@@ -19308,20 +17987,8 @@
                 <w:szCs w:val="22"/>
                 <w:lang w:eastAsia="en-US"/>
               </w:rPr>
-              <w:t xml:space="preserve">{99, Don't want to </w:t>
-            </w:r>
-            <w:proofErr w:type="gramStart"/>
-            <w:r>
-              <w:rPr>
-                <w:rFonts w:ascii="Aptos Narrow" w:eastAsia="Times New Roman" w:hAnsi="Aptos Narrow" w:cs="Times New Roman"/>
-                <w:color w:val="000000"/>
-                <w:sz w:val="22"/>
-                <w:szCs w:val="22"/>
-                <w:lang w:eastAsia="en-US"/>
-              </w:rPr>
-              <w:t>answer}...</w:t>
-            </w:r>
-            <w:proofErr w:type="gramEnd"/>
+              <w:t>{99, Don't want to answer}...</w:t>
+            </w:r>
           </w:p>
         </w:tc>
         <w:tc>
@@ -19519,20 +18186,8 @@
                 <w:szCs w:val="22"/>
                 <w:lang w:eastAsia="en-US"/>
               </w:rPr>
-              <w:t xml:space="preserve">{1, No </w:t>
-            </w:r>
-            <w:proofErr w:type="gramStart"/>
-            <w:r>
-              <w:rPr>
-                <w:rFonts w:ascii="Aptos Narrow" w:eastAsia="Times New Roman" w:hAnsi="Aptos Narrow" w:cs="Times New Roman"/>
-                <w:color w:val="000000"/>
-                <w:sz w:val="22"/>
-                <w:szCs w:val="22"/>
-                <w:lang w:eastAsia="en-US"/>
-              </w:rPr>
-              <w:t>education}...</w:t>
-            </w:r>
-            <w:proofErr w:type="gramEnd"/>
+              <w:t>{1, No education}...</w:t>
+            </w:r>
           </w:p>
         </w:tc>
         <w:tc>
@@ -20589,6 +19244,7 @@
   <w:style w:type="character" w:default="1" w:styleId="DefaultParagraphFont">
     <w:name w:val="Default Paragraph Font"/>
     <w:uiPriority w:val="1"/>
+    <w:semiHidden/>
     <w:unhideWhenUsed/>
   </w:style>
   <w:style w:type="table" w:default="1" w:styleId="TableNormal">
@@ -21267,6 +19923,21 @@
 </file>
 
 <file path=customXml/item1.xml><?xml version="1.0" encoding="utf-8"?>
+<p:properties xmlns:p="http://schemas.microsoft.com/office/2006/metadata/properties" xmlns:xsi="http://www.w3.org/2001/XMLSchema-instance" xmlns:pc="http://schemas.microsoft.com/office/infopath/2007/PartnerControls">
+  <documentManagement/>
+</p:properties>
+</file>
+
+<file path=customXml/item2.xml><?xml version="1.0" encoding="utf-8"?>
+<?mso-contentType ?>
+<FormTemplates xmlns="http://schemas.microsoft.com/sharepoint/v3/contenttype/forms">
+  <Display>DocumentLibraryForm</Display>
+  <Edit>DocumentLibraryForm</Edit>
+  <New>DocumentLibraryForm</New>
+</FormTemplates>
+</file>
+
+<file path=customXml/item3.xml><?xml version="1.0" encoding="utf-8"?>
 <ct:contentTypeSchema xmlns:ct="http://schemas.microsoft.com/office/2006/metadata/contentType" xmlns:ma="http://schemas.microsoft.com/office/2006/metadata/properties/metaAttributes" ct:_="" ma:_="" ma:contentTypeName="Document" ma:contentTypeID="0x0101008306A5DBA35A06478BB3C9C57C85CB27" ma:contentTypeVersion="4" ma:contentTypeDescription="Create a new document." ma:contentTypeScope="" ma:versionID="4b850b395f5bc5bc00a7f41b4ad16ee3">
   <xsd:schema xmlns:xsd="http://www.w3.org/2001/XMLSchema" xmlns:xs="http://www.w3.org/2001/XMLSchema" xmlns:p="http://schemas.microsoft.com/office/2006/metadata/properties" xmlns:ns3="c21c3383-6356-4074-9b73-6fe539bc47a2" targetNamespace="http://schemas.microsoft.com/office/2006/metadata/properties" ma:root="true" ma:fieldsID="8bbc14096b743362aacd08c87c85d174" ns3:_="">
     <xsd:import namespace="c21c3383-6356-4074-9b73-6fe539bc47a2"/>
@@ -21410,22 +20081,24 @@
 </ct:contentTypeSchema>
 </file>
 
-<file path=customXml/item2.xml><?xml version="1.0" encoding="utf-8"?>
-<?mso-contentType ?>
-<FormTemplates xmlns="http://schemas.microsoft.com/sharepoint/v3/contenttype/forms">
-  <Display>DocumentLibraryForm</Display>
-  <Edit>DocumentLibraryForm</Edit>
-  <New>DocumentLibraryForm</New>
-</FormTemplates>
+<file path=customXml/itemProps1.xml><?xml version="1.0" encoding="utf-8"?>
+<ds:datastoreItem xmlns:ds="http://schemas.openxmlformats.org/officeDocument/2006/customXml" ds:itemID="{7009176A-53F0-4918-BF6A-857F3C644289}">
+  <ds:schemaRefs>
+    <ds:schemaRef ds:uri="http://schemas.microsoft.com/office/2006/metadata/properties"/>
+    <ds:schemaRef ds:uri="http://schemas.microsoft.com/office/infopath/2007/PartnerControls"/>
+  </ds:schemaRefs>
+</ds:datastoreItem>
 </file>
 
-<file path=customXml/item3.xml><?xml version="1.0" encoding="utf-8"?>
-<p:properties xmlns:p="http://schemas.microsoft.com/office/2006/metadata/properties" xmlns:xsi="http://www.w3.org/2001/XMLSchema-instance" xmlns:pc="http://schemas.microsoft.com/office/infopath/2007/PartnerControls">
-  <documentManagement/>
-</p:properties>
+<file path=customXml/itemProps2.xml><?xml version="1.0" encoding="utf-8"?>
+<ds:datastoreItem xmlns:ds="http://schemas.openxmlformats.org/officeDocument/2006/customXml" ds:itemID="{350E8365-C870-4DB2-94F8-C3D820B94778}">
+  <ds:schemaRefs>
+    <ds:schemaRef ds:uri="http://schemas.microsoft.com/sharepoint/v3/contenttype/forms"/>
+  </ds:schemaRefs>
+</ds:datastoreItem>
 </file>
 
-<file path=customXml/itemProps1.xml><?xml version="1.0" encoding="utf-8"?>
+<file path=customXml/itemProps3.xml><?xml version="1.0" encoding="utf-8"?>
 <ds:datastoreItem xmlns:ds="http://schemas.openxmlformats.org/officeDocument/2006/customXml" ds:itemID="{9AFE06EC-2766-40D3-B51A-E9F751028FE4}">
   <ds:schemaRefs>
     <ds:schemaRef ds:uri="http://schemas.microsoft.com/office/2006/metadata/contentType"/>
@@ -21441,28 +20114,4 @@
     <ds:schemaRef ds:uri="http://schemas.microsoft.com/internal/obd"/>
   </ds:schemaRefs>
 </ds:datastoreItem>
-</file>
-
-<file path=customXml/itemProps2.xml><?xml version="1.0" encoding="utf-8"?>
-<ds:datastoreItem xmlns:ds="http://schemas.openxmlformats.org/officeDocument/2006/customXml" ds:itemID="{350E8365-C870-4DB2-94F8-C3D820B94778}">
-  <ds:schemaRefs>
-    <ds:schemaRef ds:uri="http://schemas.microsoft.com/sharepoint/v3/contenttype/forms"/>
-  </ds:schemaRefs>
-</ds:datastoreItem>
-</file>
-
-<file path=customXml/itemProps3.xml><?xml version="1.0" encoding="utf-8"?>
-<ds:datastoreItem xmlns:ds="http://schemas.openxmlformats.org/officeDocument/2006/customXml" ds:itemID="{7009176A-53F0-4918-BF6A-857F3C644289}">
-  <ds:schemaRefs>
-    <ds:schemaRef ds:uri="http://schemas.openxmlformats.org/package/2006/metadata/core-properties"/>
-    <ds:schemaRef ds:uri="http://purl.org/dc/terms/"/>
-    <ds:schemaRef ds:uri="http://purl.org/dc/dcmitype/"/>
-    <ds:schemaRef ds:uri="http://purl.org/dc/elements/1.1/"/>
-    <ds:schemaRef ds:uri="http://schemas.microsoft.com/office/2006/metadata/properties"/>
-    <ds:schemaRef ds:uri="http://www.w3.org/XML/1998/namespace"/>
-    <ds:schemaRef ds:uri="http://schemas.microsoft.com/office/2006/documentManagement/types"/>
-    <ds:schemaRef ds:uri="http://schemas.microsoft.com/office/infopath/2007/PartnerControls"/>
-    <ds:schemaRef ds:uri="c21c3383-6356-4074-9b73-6fe539bc47a2"/>
-  </ds:schemaRefs>
-</ds:datastoreItem>
 </file>
</xml_diff>